<commit_message>
feat: thêm phần lưu ý quan trọng vào đề mẫu
- Lưu ý: số đáp án tối thiểu, số dấu *, marker đúng/sai
- Lưu ý: không dùng bullet/numbered list của Word
- Lưu ý: hỗ trợ hình ảnh chèn trực tiếp vào câu hỏi/đáp án

Co-Authored-By: Claude <noreply@anthropic.com>
</commit_message>
<xml_diff>
--- a/data/mau-cau-hoi.docx
+++ b/data/mau-cau-hoi.docx
@@ -18,6 +18,73 @@
           <w:sz w:val="22"/>
         </w:rPr>
         <w:t>Hệ thống Trắc Nghiệm LAN</w:t>
+      </w:r>
+    </w:p>
+    <w:p/>
+    <w:p>
+      <w:r>
+        <w:rPr>
+          <w:b/>
+          <w:color w:val="B40000"/>
+          <w:sz w:val="26"/>
+        </w:rPr>
+        <w:t>*** LƯU Ý QUAN TRỌNG KHI SOẠN ĐỀ ***</w:t>
+      </w:r>
+    </w:p>
+    <w:p/>
+    <w:p>
+      <w:r>
+        <w:t>1. Mỗi câu hỏi cần ít nhất 2 đáp án (A, B, C, D...).</w:t>
+      </w:r>
+    </w:p>
+    <w:p>
+      <w:r>
+        <w:t>2. Câu 1 đáp án: phải có ĐÚNG 1 dấu * ở cuối đáp án đúng.</w:t>
+      </w:r>
+    </w:p>
+    <w:p>
+      <w:r>
+        <w:t>3. Câu nhiều đáp án [MULTI]: phải có ÍT NHẤT 2 dấu * ở các đáp án đúng.</w:t>
+      </w:r>
+    </w:p>
+    <w:p>
+      <w:r>
+        <w:t>4. Câu đúng/sai [DUNG/SAI]: MỖI phát biểu đều phải có (đúng) hoặc (sai) ở cuối.</w:t>
+      </w:r>
+    </w:p>
+    <w:p>
+      <w:r>
+        <w:t xml:space="preserve">   Cũng chấp nhận: (Đ) / (S) / (dung) / (D) / (d) / (T) / (t)</w:t>
+      </w:r>
+    </w:p>
+    <w:p>
+      <w:r>
+        <w:t>5. KHÔNG dùng bullet list hoặc numbered list của Word (Insert &gt; List).</w:t>
+      </w:r>
+    </w:p>
+    <w:p>
+      <w:r>
+        <w:t xml:space="preserve">   Chỉ gõ A. B. C. D. trực tiếp như văn bản thường.</w:t>
+      </w:r>
+    </w:p>
+    <w:p>
+      <w:r>
+        <w:t>6. Hỗ trợ hình ảnh: chèn ảnh trực tiếp vào dòng câu hỏi hoặc đáp án trong Word.</w:t>
+      </w:r>
+    </w:p>
+    <w:p>
+      <w:r>
+        <w:t xml:space="preserve">   Ảnh sẽ được nhúng vào hệ thống khi import.</w:t>
+      </w:r>
+    </w:p>
+    <w:p>
+      <w:r>
+        <w:t>7. Công thức toán: dùng \( ... \) cho LaTeX (xem Phần 4).</w:t>
+      </w:r>
+    </w:p>
+    <w:p>
+      <w:r>
+        <w:t>8. Hiển thị code: dùng [CODE] ... [/CODE] (xem Phần 5).</w:t>
       </w:r>
     </w:p>
     <w:p/>

</xml_diff>

<commit_message>
feat: trình bày đề mẫu đẹp hơn, thêm rule mặc định đáp án A
- Nền màu, border, icon phân biệt các loại nội dung
- Tiêu đề phần dùng nền xanh, rule dùng màu cam, ví dụ dùng font Courier
- Thêm quy tắc: không đánh dấu gì -> mặc định chọn đáp án A
- Liệt kê đầy đủ marker đúng/sai cho loại DUNG/SAI
- Cấu trúc 6 phần A-F với divider phân cách rõ ràng

Co-Authored-By: Claude <noreply@anthropic.com>
</commit_message>
<xml_diff>
--- a/data/mau-cau-hoi.docx
+++ b/data/mau-cau-hoi.docx
@@ -3,18 +3,26 @@
 <w:document xmlns:wpc="http://schemas.microsoft.com/office/word/2010/wordprocessingCanvas" xmlns:mo="http://schemas.microsoft.com/office/mac/office/2008/main" xmlns:mc="http://schemas.openxmlformats.org/markup-compatibility/2006" xmlns:mv="urn:schemas-microsoft-com:mac:vml" xmlns:o="urn:schemas-microsoft-com:office:office" xmlns:r="http://schemas.openxmlformats.org/officeDocument/2006/relationships" xmlns:m="http://schemas.openxmlformats.org/officeDocument/2006/math" xmlns:v="urn:schemas-microsoft-com:vml" xmlns:wp14="http://schemas.microsoft.com/office/word/2010/wordprocessingDrawing" xmlns:wp="http://schemas.openxmlformats.org/drawingml/2006/wordprocessingDrawing" xmlns:w10="urn:schemas-microsoft-com:office:word" xmlns:w="http://schemas.openxmlformats.org/wordprocessingml/2006/main" xmlns:w14="http://schemas.microsoft.com/office/word/2010/wordml" xmlns:wpg="http://schemas.microsoft.com/office/word/2010/wordprocessingGroup" xmlns:wpi="http://schemas.microsoft.com/office/word/2010/wordprocessingInk" xmlns:wne="http://schemas.microsoft.com/office/word/2006/wordml" xmlns:wps="http://schemas.microsoft.com/office/word/2010/wordprocessingShape" mc:Ignorable="w14 wp14">
   <w:body>
     <w:p>
+      <w:pPr>
+        <w:jc w:val="center"/>
+        <w:shd w:val="clear" w:color="auto" w:fill="003087"/>
+      </w:pPr>
       <w:r>
         <w:rPr>
           <w:b/>
+          <w:color w:val="FFFFFF"/>
           <w:sz w:val="28"/>
         </w:rPr>
-        <w:t>MẪU CÂU HỎI - HƯỚNG DẪN SOẠN ĐỀ THI</w:t>
+        <w:t xml:space="preserve">  MẪU CÂU HỎI — HƯỚNG DẪN SOẠN ĐỀ THI  </w:t>
       </w:r>
     </w:p>
     <w:p>
+      <w:pPr>
+        <w:jc w:val="center"/>
+        <w:shd w:val="clear" w:color="auto" w:fill="E8F0FE"/>
+      </w:pPr>
       <w:r>
         <w:rPr>
-          <w:b/>
           <w:sz w:val="22"/>
         </w:rPr>
         <w:t>Hệ thống Trắc Nghiệm LAN</w:t>
@@ -22,506 +30,978 @@
     </w:p>
     <w:p/>
     <w:p>
+      <w:pPr>
+        <w:shd w:val="clear" w:color="auto" w:fill="DDEEFF"/>
+      </w:pPr>
       <w:r>
         <w:rPr>
           <w:b/>
-          <w:color w:val="0046B4"/>
+          <w:color w:val="00328C"/>
           <w:sz w:val="24"/>
         </w:rPr>
-        <w:t>A. CẤU TRÚC TỔNG QUÁT MỖI CÂU HỎI</w:t>
+        <w:t xml:space="preserve">  A.  CẤU TRÚC TỔNG QUÁT MỖI CÂU HỎI  </w:t>
       </w:r>
     </w:p>
     <w:p/>
     <w:p>
+      <w:pPr>
+        <w:ind w:left="360"/>
+      </w:pPr>
       <w:r>
-        <w:t>Mỗi câu hỏi gồm 3 thành phần viết trên các dòng riêng:</w:t>
+        <w:rPr>
+          <w:b/>
+          <w:color w:val="B45000"/>
+        </w:rPr>
+        <w:t>◆ Dòng câu hỏi:</w:t>
+      </w:r>
+      <w:r>
+        <w:t xml:space="preserve">  Câu N.  [loại]  Nội dung câu hỏi</w:t>
       </w:r>
     </w:p>
     <w:p>
+      <w:pPr>
+        <w:ind w:left="360"/>
+      </w:pPr>
       <w:r>
-        <w:t xml:space="preserve">   1. Dòng câu hỏi:   Câu N. [loại] Nội dung câu hỏi</w:t>
+        <w:rPr>
+          <w:b/>
+          <w:color w:val="B45000"/>
+        </w:rPr>
+        <w:t>◆ Dòng đáp án:</w:t>
+      </w:r>
+      <w:r>
+        <w:t xml:space="preserve">  A. ...    B. ...    C. ...    D. ...</w:t>
       </w:r>
     </w:p>
     <w:p>
+      <w:pPr>
+        <w:ind w:left="360"/>
+      </w:pPr>
       <w:r>
-        <w:t xml:space="preserve">   2. Các dòng đáp án: A. ...   B. ...   C. ...   D. ...</w:t>
+        <w:rPr>
+          <w:b/>
+          <w:color w:val="B45000"/>
+        </w:rPr>
+        <w:t>◆ Phân cách câu:</w:t>
       </w:r>
-    </w:p>
-    <w:p>
       <w:r>
-        <w:t xml:space="preserve">   3. Dòng trắng (Enter) để phân cách với câu tiếp theo</w:t>
+        <w:t xml:space="preserve">  Để 1 dòng trắng (Enter) giữa các câu</w:t>
       </w:r>
     </w:p>
     <w:p/>
     <w:p>
+      <w:pPr>
+        <w:ind w:left="360"/>
+      </w:pPr>
       <w:r>
         <w:rPr>
           <w:b/>
+          <w:color w:val="B45000"/>
         </w:rPr>
-        <w:t xml:space="preserve">Prefix câu hỏi: </w:t>
+        <w:t>◆ Prefix câu hỏi được chấp nhận:</w:t>
       </w:r>
       <w:r>
-        <w:t>Chấp nhận "Câu 1.", "Câu 1:", "1.", "1:" (có hoặc không có chữ "Câu")</w:t>
+        <w:t xml:space="preserve">  </w:t>
       </w:r>
     </w:p>
     <w:p>
+      <w:pPr>
+        <w:ind w:left="540"/>
+        <w:shd w:val="clear" w:color="auto" w:fill="F5F5F5"/>
+      </w:pPr>
       <w:r>
         <w:rPr>
-          <w:b/>
+          <w:rFonts w:ascii="Courier New" w:hAnsi="Courier New"/>
+          <w:sz w:val="20"/>
         </w:rPr>
-        <w:t xml:space="preserve">Prefix đáp án: </w:t>
-      </w:r>
-      <w:r>
-        <w:t>Chấp nhận "A." hoặc "A)" — chỉ dùng chữ cái A B C D E...</w:t>
-      </w:r>
-    </w:p>
-    <w:p>
-      <w:r>
-        <w:rPr>
-          <w:b/>
-        </w:rPr>
-        <w:t xml:space="preserve">Tối thiểu: </w:t>
-      </w:r>
-      <w:r>
-        <w:t>Mỗi câu cần ít nhất 2 đáp án. Không giới hạn số đáp án tối đa.</w:t>
+        <w:t>Câu 1.  Câu 1:  1.  1:      (có hoặc không có chữ "Câu")</w:t>
       </w:r>
     </w:p>
     <w:p/>
     <w:p>
+      <w:pPr>
+        <w:ind w:left="360"/>
+      </w:pPr>
       <w:r>
         <w:rPr>
           <w:b/>
-          <w:color w:val="B40000"/>
-          <w:sz w:val="24"/>
+          <w:color w:val="B45000"/>
         </w:rPr>
-        <w:t>B. LƯU Ý QUAN TRỌNG</w:t>
+        <w:t>◆ Prefix đáp án được chấp nhận:</w:t>
+      </w:r>
+      <w:r>
+        <w:t xml:space="preserve">  </w:t>
+      </w:r>
+    </w:p>
+    <w:p>
+      <w:pPr>
+        <w:ind w:left="540"/>
+        <w:shd w:val="clear" w:color="auto" w:fill="F5F5F5"/>
+      </w:pPr>
+      <w:r>
+        <w:rPr>
+          <w:rFonts w:ascii="Courier New" w:hAnsi="Courier New"/>
+          <w:sz w:val="20"/>
+        </w:rPr>
+        <w:t>A.  hoặc  A)      (chỉ dùng chữ cái A B C D E...)</w:t>
       </w:r>
     </w:p>
     <w:p/>
     <w:p>
+      <w:pPr>
+        <w:ind w:left="360"/>
+      </w:pPr>
       <w:r>
         <w:rPr>
           <w:b/>
+          <w:color w:val="B45000"/>
         </w:rPr>
-        <w:t xml:space="preserve">⚠ KHÔNG dùng List của Word: </w:t>
+        <w:t>◆ Tối thiểu:</w:t>
       </w:r>
       <w:r>
-        <w:t>Không Insert &gt; Bullets/Numbering. Chỉ gõ A. B. C. D. như văn bản thường.</w:t>
-      </w:r>
-    </w:p>
-    <w:p>
-      <w:r>
-        <w:rPr>
-          <w:b/>
-        </w:rPr>
-        <w:t xml:space="preserve">⚠ Mỗi dòng là một đoạn riêng: </w:t>
-      </w:r>
-      <w:r>
-        <w:t>Câu hỏi, mỗi đáp án, [CODE], [/CODE] đều phải là đoạn văn bản riêng (Enter xuống dòng).</w:t>
-      </w:r>
-    </w:p>
-    <w:p>
-      <w:r>
-        <w:rPr>
-          <w:b/>
-        </w:rPr>
-        <w:t xml:space="preserve">⚠ Dòng trắng giữa các câu: </w:t>
-      </w:r>
-      <w:r>
-        <w:t>Nên có 1 dòng trắng (Enter) giữa các câu để dễ đọc. Không bắt buộc.</w:t>
-      </w:r>
-    </w:p>
-    <w:p>
-      <w:r>
-        <w:rPr>
-          <w:b/>
-        </w:rPr>
-        <w:t xml:space="preserve">⚠ Tiêu đề phần không bị import: </w:t>
-      </w:r>
-      <w:r>
-        <w:t>Dòng không bắt đầu bằng "Câu N." và không bắt đầu bằng chữ cái + dấu chấm sẽ bị bỏ qua.</w:t>
-      </w:r>
-    </w:p>
-    <w:p>
-      <w:r>
-        <w:rPr>
-          <w:b/>
-        </w:rPr>
-        <w:t xml:space="preserve">⚠ Hình ảnh: </w:t>
-      </w:r>
-      <w:r>
-        <w:t>Chèn ảnh trực tiếp vào dòng câu hỏi hoặc đáp án trong Word. Ảnh được nhúng base64 khi import.</w:t>
+        <w:t xml:space="preserve">  Mỗi câu cần ít nhất 2 đáp án. Tối đa không giới hạn.</w:t>
       </w:r>
     </w:p>
     <w:p/>
     <w:p>
+      <w:pPr>
+        <w:shd w:val="clear" w:color="auto" w:fill="DDEEFF"/>
+      </w:pPr>
       <w:r>
         <w:rPr>
           <w:b/>
-          <w:color w:val="0046B4"/>
+          <w:color w:val="00328C"/>
           <w:sz w:val="24"/>
         </w:rPr>
-        <w:t>C. CÁC LOẠI CÂU HỎI</w:t>
+        <w:t xml:space="preserve">  B.  LƯU Ý QUAN TRỌNG  </w:t>
       </w:r>
     </w:p>
     <w:p/>
     <w:p>
+      <w:pPr>
+        <w:ind w:left="360"/>
+        <w:shd w:val="clear" w:color="auto" w:fill="FFF3CD"/>
+      </w:pPr>
       <w:r>
         <w:rPr>
-          <w:b/>
-          <w:color w:val="006400"/>
+          <w:color w:val="8C4600"/>
           <w:sz w:val="22"/>
         </w:rPr>
-        <w:t>LOẠI 1. MỘT ĐÁP ÁN ĐÚNG (mặc định)</w:t>
+        <w:t>⚠  KHÔNG dùng tính năng Bullets / Numbering của Word.  Chỉ gõ A. B. C. D. như văn bản thường.</w:t>
+      </w:r>
+    </w:p>
+    <w:p>
+      <w:pPr>
+        <w:ind w:left="360"/>
+        <w:shd w:val="clear" w:color="auto" w:fill="FFF3CD"/>
+      </w:pPr>
+      <w:r>
+        <w:rPr>
+          <w:color w:val="8C4600"/>
+          <w:sz w:val="22"/>
+        </w:rPr>
+        <w:t>⚠  Câu hỏi, mỗi đáp án, [CODE], [/CODE] đều phải là đoạn văn bản riêng (nhấn Enter xuống dòng).</w:t>
+      </w:r>
+    </w:p>
+    <w:p>
+      <w:pPr>
+        <w:ind w:left="360"/>
+        <w:shd w:val="clear" w:color="auto" w:fill="FFF3CD"/>
+      </w:pPr>
+      <w:r>
+        <w:rPr>
+          <w:color w:val="8C4600"/>
+          <w:sz w:val="22"/>
+        </w:rPr>
+        <w:t>⚠  Hình ảnh: Chèn ảnh trực tiếp vào dòng câu hỏi hoặc đáp án trong Word. Ảnh được nhúng tự động khi import.</w:t>
+      </w:r>
+    </w:p>
+    <w:p>
+      <w:pPr>
+        <w:ind w:left="360"/>
+        <w:shd w:val="clear" w:color="auto" w:fill="FFF3CD"/>
+      </w:pPr>
+      <w:r>
+        <w:rPr>
+          <w:color w:val="8C4600"/>
+          <w:sz w:val="22"/>
+        </w:rPr>
+        <w:t>⚠  Dòng không bắt đầu bằng "Câu N." hoặc chữ cái + dấu chấm sẽ bị bỏ qua (tiêu đề, mô tả, v.v.).</w:t>
       </w:r>
     </w:p>
     <w:p/>
     <w:p>
+      <w:pPr>
+        <w:shd w:val="clear" w:color="auto" w:fill="DDEEFF"/>
+      </w:pPr>
       <w:r>
         <w:rPr>
           <w:b/>
+          <w:color w:val="00328C"/>
+          <w:sz w:val="24"/>
         </w:rPr>
-        <w:t xml:space="preserve">Quy tắc: </w:t>
-      </w:r>
-      <w:r>
-        <w:t>Thêm dấu * vào cuối đáp án đúng (đúng 1 dấu *). Hoặc viết (đúng) cuối đáp án đúng.</w:t>
-      </w:r>
-    </w:p>
-    <w:p>
-      <w:r>
-        <w:rPr>
-          <w:b/>
-        </w:rPr>
-        <w:t xml:space="preserve">Không cần: </w:t>
-      </w:r>
-      <w:r>
-        <w:t>Không cần thêm từ khóa gì vào đầu câu hỏi.</w:t>
+        <w:t xml:space="preserve">  C.  CÁC LOẠI CÂU HỎI  </w:t>
       </w:r>
     </w:p>
     <w:p/>
     <w:p>
+      <w:pPr>
+        <w:shd w:val="clear" w:color="auto" w:fill="F0FFF0"/>
+      </w:pPr>
       <w:r>
+        <w:rPr>
+          <w:b/>
+          <w:color w:val="007800"/>
+          <w:sz w:val="22"/>
+        </w:rPr>
+        <w:t xml:space="preserve">  ▸  LOẠI 1.  Một đáp án đúng  (mặc định, không cần tag)  </w:t>
+      </w:r>
+    </w:p>
+    <w:p/>
+    <w:p>
+      <w:pPr>
+        <w:ind w:left="360"/>
+      </w:pPr>
+      <w:r>
+        <w:rPr>
+          <w:b/>
+          <w:color w:val="B45000"/>
+        </w:rPr>
+        <w:t>◆ Đánh dấu đáp án đúng:</w:t>
+      </w:r>
+      <w:r>
+        <w:t xml:space="preserve">  Thêm dấu  *  sau đáp án đúng (đúng 1 dấu *)</w:t>
+      </w:r>
+    </w:p>
+    <w:p>
+      <w:pPr>
+        <w:ind w:left="360"/>
+      </w:pPr>
+      <w:r>
+        <w:rPr>
+          <w:b/>
+          <w:color w:val="B45000"/>
+        </w:rPr>
+        <w:t>◆ Hoặc:</w:t>
+      </w:r>
+      <w:r>
+        <w:t xml:space="preserve">  Viết  (đúng)  hoặc  (dung)  ở cuối đáp án đúng</w:t>
+      </w:r>
+    </w:p>
+    <w:p>
+      <w:pPr>
+        <w:ind w:left="360"/>
+      </w:pPr>
+      <w:r>
+        <w:rPr>
+          <w:b/>
+          <w:color w:val="B45000"/>
+        </w:rPr>
+        <w:t>◆ Mặc định:</w:t>
+      </w:r>
+      <w:r>
+        <w:t xml:space="preserve">  Nếu KHÔNG đánh dấu gì cả → hệ thống tự chọn đáp án A làm đáp án đúng</w:t>
+      </w:r>
+    </w:p>
+    <w:p/>
+    <w:p>
+      <w:pPr>
+        <w:ind w:left="540"/>
+        <w:shd w:val="clear" w:color="auto" w:fill="F5F5F5"/>
+      </w:pPr>
+      <w:r>
+        <w:rPr>
+          <w:rFonts w:ascii="Courier New" w:hAnsi="Courier New"/>
+          <w:sz w:val="20"/>
+        </w:rPr>
         <w:t>Câu 1. Thủ đô của Việt Nam là thành phố nào?</w:t>
       </w:r>
     </w:p>
     <w:p>
+      <w:pPr>
+        <w:ind w:left="540"/>
+        <w:shd w:val="clear" w:color="auto" w:fill="F5F5F5"/>
+      </w:pPr>
       <w:r>
+        <w:rPr>
+          <w:rFonts w:ascii="Courier New" w:hAnsi="Courier New"/>
+          <w:sz w:val="20"/>
+        </w:rPr>
         <w:t>A. TP. Hồ Chí Minh</w:t>
       </w:r>
     </w:p>
     <w:p>
+      <w:pPr>
+        <w:ind w:left="540"/>
+        <w:shd w:val="clear" w:color="auto" w:fill="F5F5F5"/>
+      </w:pPr>
       <w:r>
+        <w:rPr>
+          <w:rFonts w:ascii="Courier New" w:hAnsi="Courier New"/>
+          <w:sz w:val="20"/>
+        </w:rPr>
         <w:t>B. Hà Nội *</w:t>
       </w:r>
     </w:p>
     <w:p>
+      <w:pPr>
+        <w:ind w:left="540"/>
+        <w:shd w:val="clear" w:color="auto" w:fill="F5F5F5"/>
+      </w:pPr>
       <w:r>
+        <w:rPr>
+          <w:rFonts w:ascii="Courier New" w:hAnsi="Courier New"/>
+          <w:sz w:val="20"/>
+        </w:rPr>
         <w:t>C. Đà Nẵng</w:t>
       </w:r>
     </w:p>
     <w:p>
+      <w:pPr>
+        <w:ind w:left="540"/>
+        <w:shd w:val="clear" w:color="auto" w:fill="F5F5F5"/>
+      </w:pPr>
       <w:r>
+        <w:rPr>
+          <w:rFonts w:ascii="Courier New" w:hAnsi="Courier New"/>
+          <w:sz w:val="20"/>
+        </w:rPr>
         <w:t>D. Cần Thơ</w:t>
       </w:r>
     </w:p>
     <w:p/>
     <w:p>
+      <w:pPr>
+        <w:ind w:left="540"/>
+        <w:shd w:val="clear" w:color="auto" w:fill="F5F5F5"/>
+      </w:pPr>
       <w:r>
+        <w:rPr>
+          <w:rFonts w:ascii="Courier New" w:hAnsi="Courier New"/>
+          <w:sz w:val="20"/>
+        </w:rPr>
         <w:t>Câu 2. Năm nào Việt Nam thống nhất đất nước?</w:t>
       </w:r>
     </w:p>
     <w:p>
+      <w:pPr>
+        <w:ind w:left="540"/>
+        <w:shd w:val="clear" w:color="auto" w:fill="F5F5F5"/>
+      </w:pPr>
       <w:r>
+        <w:rPr>
+          <w:rFonts w:ascii="Courier New" w:hAnsi="Courier New"/>
+          <w:sz w:val="20"/>
+        </w:rPr>
         <w:t>A. 1954</w:t>
       </w:r>
     </w:p>
     <w:p>
+      <w:pPr>
+        <w:ind w:left="540"/>
+        <w:shd w:val="clear" w:color="auto" w:fill="F5F5F5"/>
+      </w:pPr>
       <w:r>
+        <w:rPr>
+          <w:rFonts w:ascii="Courier New" w:hAnsi="Courier New"/>
+          <w:sz w:val="20"/>
+        </w:rPr>
         <w:t>B. 1968</w:t>
       </w:r>
     </w:p>
     <w:p>
+      <w:pPr>
+        <w:ind w:left="540"/>
+        <w:shd w:val="clear" w:color="auto" w:fill="F5F5F5"/>
+      </w:pPr>
       <w:r>
+        <w:rPr>
+          <w:rFonts w:ascii="Courier New" w:hAnsi="Courier New"/>
+          <w:sz w:val="20"/>
+        </w:rPr>
         <w:t>C. 1975 (đúng)</w:t>
       </w:r>
     </w:p>
     <w:p>
+      <w:pPr>
+        <w:ind w:left="540"/>
+        <w:shd w:val="clear" w:color="auto" w:fill="F5F5F5"/>
+      </w:pPr>
       <w:r>
+        <w:rPr>
+          <w:rFonts w:ascii="Courier New" w:hAnsi="Courier New"/>
+          <w:sz w:val="20"/>
+        </w:rPr>
         <w:t>D. 1986</w:t>
       </w:r>
     </w:p>
     <w:p/>
     <w:p>
+      <w:pPr>
+        <w:ind w:left="540"/>
+        <w:shd w:val="clear" w:color="auto" w:fill="F5F5F5"/>
+      </w:pPr>
       <w:r>
         <w:rPr>
-          <w:b/>
-          <w:color w:val="006400"/>
-          <w:sz w:val="22"/>
+          <w:rFonts w:ascii="Courier New" w:hAnsi="Courier New"/>
+          <w:sz w:val="20"/>
         </w:rPr>
-        <w:t>LOẠI 2. NHIỀU ĐÁP ÁN ĐÚNG [MULTI]</w:t>
+        <w:t>Câu 3. Đây là ví dụ KHÔNG đánh dấu → hệ thống chọn A làm đúng</w:t>
+      </w:r>
+    </w:p>
+    <w:p>
+      <w:pPr>
+        <w:ind w:left="540"/>
+        <w:shd w:val="clear" w:color="auto" w:fill="F5F5F5"/>
+      </w:pPr>
+      <w:r>
+        <w:rPr>
+          <w:rFonts w:ascii="Courier New" w:hAnsi="Courier New"/>
+          <w:sz w:val="20"/>
+        </w:rPr>
+        <w:t>A. Đáp án này được chọn tự động là ĐÚNG</w:t>
+      </w:r>
+    </w:p>
+    <w:p>
+      <w:pPr>
+        <w:ind w:left="540"/>
+        <w:shd w:val="clear" w:color="auto" w:fill="F5F5F5"/>
+      </w:pPr>
+      <w:r>
+        <w:rPr>
+          <w:rFonts w:ascii="Courier New" w:hAnsi="Courier New"/>
+          <w:sz w:val="20"/>
+        </w:rPr>
+        <w:t>B. Đáp án sai</w:t>
+      </w:r>
+    </w:p>
+    <w:p>
+      <w:pPr>
+        <w:ind w:left="540"/>
+        <w:shd w:val="clear" w:color="auto" w:fill="F5F5F5"/>
+      </w:pPr>
+      <w:r>
+        <w:rPr>
+          <w:rFonts w:ascii="Courier New" w:hAnsi="Courier New"/>
+          <w:sz w:val="20"/>
+        </w:rPr>
+        <w:t>C. Đáp án sai</w:t>
       </w:r>
     </w:p>
     <w:p/>
     <w:p>
+      <w:pPr>
+        <w:pBdr>
+          <w:top w:val="single" w:sz="4" w:space="4" w:color="CCCCCC"/>
+          <w:left w:val="single" w:sz="4" w:space="4" w:color="CCCCCC"/>
+          <w:bottom w:val="single" w:sz="4" w:space="4" w:color="CCCCCC"/>
+          <w:right w:val="single" w:sz="4" w:space="4" w:color="CCCCCC"/>
+        </w:pBdr>
+      </w:pPr>
+      <w:r/>
+    </w:p>
+    <w:p/>
+    <w:p>
+      <w:pPr>
+        <w:shd w:val="clear" w:color="auto" w:fill="F0FFF0"/>
+      </w:pPr>
       <w:r>
         <w:rPr>
           <w:b/>
+          <w:color w:val="007800"/>
+          <w:sz w:val="22"/>
         </w:rPr>
-        <w:t xml:space="preserve">Quy tắc: </w:t>
-      </w:r>
-      <w:r>
-        <w:t>Thêm [MULTI] vào đầu câu hỏi. Đánh dấu * vào cuối MỖI đáp án đúng (ít nhất 2 dấu *).</w:t>
-      </w:r>
-    </w:p>
-    <w:p>
-      <w:r>
-        <w:rPr>
-          <w:b/>
-        </w:rPr>
-        <w:t xml:space="preserve">Chấp nhận: </w:t>
-      </w:r>
-      <w:r>
-        <w:t>[MULTI] hoặc [multi] (không phân biệt hoa thường).</w:t>
+        <w:t xml:space="preserve">  ▸  LOẠI 2.  Nhiều đáp án đúng  [MULTI]  </w:t>
       </w:r>
     </w:p>
     <w:p/>
     <w:p>
+      <w:pPr>
+        <w:ind w:left="360"/>
+      </w:pPr>
       <w:r>
-        <w:t>Câu 3. [MULTI] Chọn các thành phố trực thuộc Trung ương của Việt Nam:</w:t>
+        <w:rPr>
+          <w:b/>
+          <w:color w:val="B45000"/>
+        </w:rPr>
+        <w:t>◆ Tag:</w:t>
+      </w:r>
+      <w:r>
+        <w:t xml:space="preserve">  Thêm  [MULTI]  vào đầu câu hỏi (không phân biệt hoa thường)</w:t>
       </w:r>
     </w:p>
     <w:p>
+      <w:pPr>
+        <w:ind w:left="360"/>
+      </w:pPr>
       <w:r>
+        <w:rPr>
+          <w:b/>
+          <w:color w:val="B45000"/>
+        </w:rPr>
+        <w:t>◆ Đánh dấu:</w:t>
+      </w:r>
+      <w:r>
+        <w:t xml:space="preserve">  Thêm  *  vào cuối MỖI đáp án đúng (ít nhất 2 dấu *)</w:t>
+      </w:r>
+    </w:p>
+    <w:p/>
+    <w:p>
+      <w:pPr>
+        <w:ind w:left="540"/>
+        <w:shd w:val="clear" w:color="auto" w:fill="F5F5F5"/>
+      </w:pPr>
+      <w:r>
+        <w:rPr>
+          <w:rFonts w:ascii="Courier New" w:hAnsi="Courier New"/>
+          <w:sz w:val="20"/>
+        </w:rPr>
+        <w:t>Câu 4. [MULTI] Chọn các thành phố trực thuộc Trung ương của Việt Nam:</w:t>
+      </w:r>
+    </w:p>
+    <w:p>
+      <w:pPr>
+        <w:ind w:left="540"/>
+        <w:shd w:val="clear" w:color="auto" w:fill="F5F5F5"/>
+      </w:pPr>
+      <w:r>
+        <w:rPr>
+          <w:rFonts w:ascii="Courier New" w:hAnsi="Courier New"/>
+          <w:sz w:val="20"/>
+        </w:rPr>
         <w:t>A. Hà Nội *</w:t>
       </w:r>
     </w:p>
     <w:p>
+      <w:pPr>
+        <w:ind w:left="540"/>
+        <w:shd w:val="clear" w:color="auto" w:fill="F5F5F5"/>
+      </w:pPr>
       <w:r>
+        <w:rPr>
+          <w:rFonts w:ascii="Courier New" w:hAnsi="Courier New"/>
+          <w:sz w:val="20"/>
+        </w:rPr>
         <w:t>B. Nghệ An</w:t>
       </w:r>
     </w:p>
     <w:p>
+      <w:pPr>
+        <w:ind w:left="540"/>
+        <w:shd w:val="clear" w:color="auto" w:fill="F5F5F5"/>
+      </w:pPr>
       <w:r>
+        <w:rPr>
+          <w:rFonts w:ascii="Courier New" w:hAnsi="Courier New"/>
+          <w:sz w:val="20"/>
+        </w:rPr>
         <w:t>C. TP. Hồ Chí Minh *</w:t>
       </w:r>
     </w:p>
     <w:p>
+      <w:pPr>
+        <w:ind w:left="540"/>
+        <w:shd w:val="clear" w:color="auto" w:fill="F5F5F5"/>
+      </w:pPr>
       <w:r>
+        <w:rPr>
+          <w:rFonts w:ascii="Courier New" w:hAnsi="Courier New"/>
+          <w:sz w:val="20"/>
+        </w:rPr>
         <w:t>D. Đà Nẵng *</w:t>
       </w:r>
     </w:p>
     <w:p>
+      <w:pPr>
+        <w:ind w:left="540"/>
+        <w:shd w:val="clear" w:color="auto" w:fill="F5F5F5"/>
+      </w:pPr>
       <w:r>
+        <w:rPr>
+          <w:rFonts w:ascii="Courier New" w:hAnsi="Courier New"/>
+          <w:sz w:val="20"/>
+        </w:rPr>
         <w:t>E. Cần Thơ *</w:t>
       </w:r>
     </w:p>
     <w:p/>
     <w:p>
+      <w:pPr>
+        <w:pBdr>
+          <w:top w:val="single" w:sz="4" w:space="4" w:color="CCCCCC"/>
+          <w:left w:val="single" w:sz="4" w:space="4" w:color="CCCCCC"/>
+          <w:bottom w:val="single" w:sz="4" w:space="4" w:color="CCCCCC"/>
+          <w:right w:val="single" w:sz="4" w:space="4" w:color="CCCCCC"/>
+        </w:pBdr>
+      </w:pPr>
+      <w:r/>
+    </w:p>
+    <w:p/>
+    <w:p>
+      <w:pPr>
+        <w:shd w:val="clear" w:color="auto" w:fill="F0FFF0"/>
+      </w:pPr>
       <w:r>
         <w:rPr>
           <w:b/>
-          <w:color w:val="006400"/>
+          <w:color w:val="007800"/>
           <w:sz w:val="22"/>
         </w:rPr>
-        <w:t>LOẠI 3. ĐÚNG/SAI [DUNG/SAI]</w:t>
+        <w:t xml:space="preserve">  ▸  LOẠI 3.  Đúng / Sai  [DUNG/SAI]  </w:t>
       </w:r>
     </w:p>
     <w:p/>
     <w:p>
+      <w:pPr>
+        <w:ind w:left="360"/>
+      </w:pPr>
       <w:r>
         <w:rPr>
           <w:b/>
+          <w:color w:val="B45000"/>
         </w:rPr>
-        <w:t xml:space="preserve">Quy tắc: </w:t>
+        <w:t>◆ Tag chấp nhận:</w:t>
       </w:r>
       <w:r>
-        <w:t>Thêm [DUNG/SAI] vào đầu câu hỏi. MỖI đáp án phải có marker đúng/sai ở cuối.</w:t>
+        <w:t xml:space="preserve">  [DUNG/SAI]  [ĐÚNG/SAI]  [DUNGSAI]  (không phân biệt hoa thường)</w:t>
       </w:r>
     </w:p>
     <w:p>
+      <w:pPr>
+        <w:ind w:left="360"/>
+      </w:pPr>
       <w:r>
         <w:rPr>
           <w:b/>
+          <w:color w:val="B45000"/>
         </w:rPr>
-        <w:t xml:space="preserve">Marker đúng: </w:t>
+        <w:t>◆ Quy tắc:</w:t>
       </w:r>
       <w:r>
-        <w:t>(đúng)  (dung)  (Đ)  (đ)  (D)  (d)  (T)  (t)  (Y)  (y)</w:t>
-      </w:r>
-    </w:p>
-    <w:p>
-      <w:r>
-        <w:rPr>
-          <w:b/>
-        </w:rPr>
-        <w:t xml:space="preserve">Marker sai: </w:t>
-      </w:r>
-      <w:r>
-        <w:t>(sai)  (S)  (s)  (F)  (f)  (N)  (n)</w:t>
-      </w:r>
-    </w:p>
-    <w:p>
-      <w:r>
-        <w:rPr>
-          <w:b/>
-        </w:rPr>
-        <w:t xml:space="preserve">Chấp nhận: </w:t>
-      </w:r>
-      <w:r>
-        <w:t>[DUNG/SAI]  [ĐÚNG/SAI]  [DUNGSAI]  (không phân biệt hoa thường)</w:t>
+        <w:t xml:space="preserve">  MỖI đáp án phải có marker đúng/sai ở cuối dòng</w:t>
       </w:r>
     </w:p>
     <w:p/>
     <w:p>
+      <w:pPr>
+        <w:ind w:left="360"/>
+      </w:pPr>
       <w:r>
-        <w:t>Câu 4. [DUNG/SAI] Xác định tính đúng/sai của các phát biểu:</w:t>
+        <w:rPr>
+          <w:b/>
+          <w:color w:val="B45000"/>
+        </w:rPr>
+        <w:t>◆ Marker ĐÚNG:</w:t>
+      </w:r>
+      <w:r>
+        <w:t xml:space="preserve">  </w:t>
       </w:r>
     </w:p>
     <w:p>
+      <w:pPr>
+        <w:ind w:left="540"/>
+        <w:shd w:val="clear" w:color="auto" w:fill="F5F5F5"/>
+      </w:pPr>
       <w:r>
+        <w:rPr>
+          <w:rFonts w:ascii="Courier New" w:hAnsi="Courier New"/>
+          <w:sz w:val="20"/>
+        </w:rPr>
+        <w:t>(đúng)   (dung)   (Đ)   (đ)   (D)   (d)   (T)   (t)   (Y)   (y)</w:t>
+      </w:r>
+    </w:p>
+    <w:p/>
+    <w:p>
+      <w:pPr>
+        <w:ind w:left="360"/>
+      </w:pPr>
+      <w:r>
+        <w:rPr>
+          <w:b/>
+          <w:color w:val="B45000"/>
+        </w:rPr>
+        <w:t>◆ Marker SAI:</w:t>
+      </w:r>
+      <w:r>
+        <w:t xml:space="preserve">  </w:t>
+      </w:r>
+    </w:p>
+    <w:p>
+      <w:pPr>
+        <w:ind w:left="540"/>
+        <w:shd w:val="clear" w:color="auto" w:fill="F5F5F5"/>
+      </w:pPr>
+      <w:r>
+        <w:rPr>
+          <w:rFonts w:ascii="Courier New" w:hAnsi="Courier New"/>
+          <w:sz w:val="20"/>
+        </w:rPr>
+        <w:t>(sai)   (S)   (s)   (F)   (f)   (N)   (n)</w:t>
+      </w:r>
+    </w:p>
+    <w:p/>
+    <w:p>
+      <w:pPr>
+        <w:ind w:left="540"/>
+        <w:shd w:val="clear" w:color="auto" w:fill="F5F5F5"/>
+      </w:pPr>
+      <w:r>
+        <w:rPr>
+          <w:rFonts w:ascii="Courier New" w:hAnsi="Courier New"/>
+          <w:sz w:val="20"/>
+        </w:rPr>
+        <w:t>Câu 5. [DUNG/SAI] Xác định tính đúng/sai của các phát biểu:</w:t>
+      </w:r>
+    </w:p>
+    <w:p>
+      <w:pPr>
+        <w:ind w:left="540"/>
+        <w:shd w:val="clear" w:color="auto" w:fill="F5F5F5"/>
+      </w:pPr>
+      <w:r>
+        <w:rPr>
+          <w:rFonts w:ascii="Courier New" w:hAnsi="Courier New"/>
+          <w:sz w:val="20"/>
+        </w:rPr>
         <w:t>A. Hà Nội là thủ đô Việt Nam. (đúng)</w:t>
       </w:r>
     </w:p>
     <w:p>
+      <w:pPr>
+        <w:ind w:left="540"/>
+        <w:shd w:val="clear" w:color="auto" w:fill="F5F5F5"/>
+      </w:pPr>
       <w:r>
+        <w:rPr>
+          <w:rFonts w:ascii="Courier New" w:hAnsi="Courier New"/>
+          <w:sz w:val="20"/>
+        </w:rPr>
         <w:t>B. Việt Nam không có biên giới với Trung Quốc. (sai)</w:t>
       </w:r>
     </w:p>
     <w:p>
+      <w:pPr>
+        <w:ind w:left="540"/>
+        <w:shd w:val="clear" w:color="auto" w:fill="F5F5F5"/>
+      </w:pPr>
       <w:r>
-        <w:t>C. Sông Hồng chảy qua Hà Nội. (đúng)</w:t>
+        <w:rPr>
+          <w:rFonts w:ascii="Courier New" w:hAnsi="Courier New"/>
+          <w:sz w:val="20"/>
+        </w:rPr>
+        <w:t>C. Sông Hồng chảy qua Hà Nội. (D)</w:t>
       </w:r>
     </w:p>
     <w:p>
+      <w:pPr>
+        <w:ind w:left="540"/>
+        <w:shd w:val="clear" w:color="auto" w:fill="F5F5F5"/>
+      </w:pPr>
       <w:r>
-        <w:t>D. Việt Nam có 63 tỉnh thành. (đúng)</w:t>
+        <w:rPr>
+          <w:rFonts w:ascii="Courier New" w:hAnsi="Courier New"/>
+          <w:sz w:val="20"/>
+        </w:rPr>
+        <w:t>D. Việt Nam có 63 tỉnh thành. (Y)</w:t>
       </w:r>
     </w:p>
     <w:p/>
     <w:p>
+      <w:pPr>
+        <w:shd w:val="clear" w:color="auto" w:fill="DDEEFF"/>
+      </w:pPr>
       <w:r>
         <w:rPr>
           <w:b/>
-          <w:color w:val="0046B4"/>
+          <w:color w:val="00328C"/>
           <w:sz w:val="24"/>
         </w:rPr>
-        <w:t>D. CÔNG THỨC TOÁN (LaTeX / KaTeX)</w:t>
+        <w:t xml:space="preserve">  D.  CÔNG THỨC TOÁN  (LATEX / KATEX)  </w:t>
       </w:r>
     </w:p>
     <w:p/>
     <w:p>
+      <w:pPr>
+        <w:ind w:left="360"/>
+      </w:pPr>
       <w:r>
         <w:rPr>
           <w:b/>
+          <w:color w:val="B45000"/>
         </w:rPr>
-        <w:t xml:space="preserve">Cú pháp inline: </w:t>
+        <w:t>◆ Inline — trong dòng chữ:</w:t>
       </w:r>
       <w:r>
-        <w:t>\( công_thức \)  — hiển thị trong dòng chữ</w:t>
+        <w:t xml:space="preserve">  \( công_thức \)</w:t>
       </w:r>
     </w:p>
     <w:p>
+      <w:pPr>
+        <w:ind w:left="360"/>
+      </w:pPr>
       <w:r>
         <w:rPr>
           <w:b/>
+          <w:color w:val="B45000"/>
         </w:rPr>
-        <w:t xml:space="preserve">Cú pháp dòng riêng: </w:t>
+        <w:t>◆ Display — dòng riêng, căn giữa:</w:t>
       </w:r>
       <w:r>
-        <w:t>\[ công_thức \]  — hiển thị to, căn giữa</w:t>
+        <w:t xml:space="preserve">  \[ công_thức \]</w:t>
       </w:r>
     </w:p>
     <w:p>
+      <w:pPr>
+        <w:ind w:left="360"/>
+      </w:pPr>
       <w:r>
         <w:rPr>
           <w:b/>
+          <w:color w:val="B45000"/>
         </w:rPr>
-        <w:t xml:space="preserve">Lưu ý: </w:t>
+        <w:t>◆ Công thức Word (OMML):</w:t>
       </w:r>
       <w:r>
-        <w:t>Có thể viết LaTeX trực tiếp trong câu hỏi, đáp án, hoặc dùng công thức Word (OMML) — cả hai đều được nhận.</w:t>
+        <w:t xml:space="preserve">  Chèn công thức bằng Insert &gt; Equation trong Word — cũng được hỗ trợ</w:t>
       </w:r>
     </w:p>
     <w:p/>
     <w:p>
+      <w:pPr>
+        <w:ind w:left="540"/>
+        <w:shd w:val="clear" w:color="auto" w:fill="F5F5F5"/>
+      </w:pPr>
       <w:r>
-        <w:t>Câu 5. Giá trị của \(\sqrt{4} + \sqrt{9}\) bằng bao nhiêu?</w:t>
+        <w:rPr>
+          <w:rFonts w:ascii="Courier New" w:hAnsi="Courier New"/>
+          <w:sz w:val="20"/>
+        </w:rPr>
+        <w:t>Câu 6. Giá trị của \(\sqrt{4} + \sqrt{9}\) bằng bao nhiêu?</w:t>
       </w:r>
     </w:p>
     <w:p>
+      <w:pPr>
+        <w:ind w:left="540"/>
+        <w:shd w:val="clear" w:color="auto" w:fill="F5F5F5"/>
+      </w:pPr>
       <w:r>
+        <w:rPr>
+          <w:rFonts w:ascii="Courier New" w:hAnsi="Courier New"/>
+          <w:sz w:val="20"/>
+        </w:rPr>
         <w:t>A. 2</w:t>
       </w:r>
     </w:p>
     <w:p>
+      <w:pPr>
+        <w:ind w:left="540"/>
+        <w:shd w:val="clear" w:color="auto" w:fill="F5F5F5"/>
+      </w:pPr>
       <w:r>
+        <w:rPr>
+          <w:rFonts w:ascii="Courier New" w:hAnsi="Courier New"/>
+          <w:sz w:val="20"/>
+        </w:rPr>
         <w:t>B. 3</w:t>
       </w:r>
     </w:p>
     <w:p>
+      <w:pPr>
+        <w:ind w:left="540"/>
+        <w:shd w:val="clear" w:color="auto" w:fill="F5F5F5"/>
+      </w:pPr>
       <w:r>
+        <w:rPr>
+          <w:rFonts w:ascii="Courier New" w:hAnsi="Courier New"/>
+          <w:sz w:val="20"/>
+        </w:rPr>
         <w:t>C. 5 *</w:t>
       </w:r>
     </w:p>
     <w:p>
+      <w:pPr>
+        <w:ind w:left="540"/>
+        <w:shd w:val="clear" w:color="auto" w:fill="F5F5F5"/>
+      </w:pPr>
       <w:r>
+        <w:rPr>
+          <w:rFonts w:ascii="Courier New" w:hAnsi="Courier New"/>
+          <w:sz w:val="20"/>
+        </w:rPr>
         <w:t>D. 7</w:t>
       </w:r>
     </w:p>
     <w:p/>
     <w:p>
+      <w:pPr>
+        <w:ind w:left="540"/>
+        <w:shd w:val="clear" w:color="auto" w:fill="F5F5F5"/>
+      </w:pPr>
       <w:r>
-        <w:t>Câu 6. Nghiệm của phương trình \(x^2 - 5x + 6 = 0\) là:</w:t>
+        <w:rPr>
+          <w:rFonts w:ascii="Courier New" w:hAnsi="Courier New"/>
+          <w:sz w:val="20"/>
+        </w:rPr>
+        <w:t>Câu 7. Nghiệm của phương trình \(x^2 - 5x + 6 = 0\) là:</w:t>
       </w:r>
     </w:p>
     <w:p>
+      <w:pPr>
+        <w:ind w:left="540"/>
+        <w:shd w:val="clear" w:color="auto" w:fill="F5F5F5"/>
+      </w:pPr>
       <w:r>
+        <w:rPr>
+          <w:rFonts w:ascii="Courier New" w:hAnsi="Courier New"/>
+          <w:sz w:val="20"/>
+        </w:rPr>
         <w:t>A. \(x = 1\) hoặc \(x = 6\)</w:t>
       </w:r>
     </w:p>
     <w:p>
+      <w:pPr>
+        <w:ind w:left="540"/>
+        <w:shd w:val="clear" w:color="auto" w:fill="F5F5F5"/>
+      </w:pPr>
       <w:r>
+        <w:rPr>
+          <w:rFonts w:ascii="Courier New" w:hAnsi="Courier New"/>
+          <w:sz w:val="20"/>
+        </w:rPr>
         <w:t>B. \(x = 2\) hoặc \(x = 3\) *</w:t>
       </w:r>
     </w:p>
     <w:p>
+      <w:pPr>
+        <w:ind w:left="540"/>
+        <w:shd w:val="clear" w:color="auto" w:fill="F5F5F5"/>
+      </w:pPr>
       <w:r>
+        <w:rPr>
+          <w:rFonts w:ascii="Courier New" w:hAnsi="Courier New"/>
+          <w:sz w:val="20"/>
+        </w:rPr>
         <w:t>C. \(x = -2\) hoặc \(x = -3\)</w:t>
       </w:r>
     </w:p>
     <w:p>
+      <w:pPr>
+        <w:ind w:left="540"/>
+        <w:shd w:val="clear" w:color="auto" w:fill="F5F5F5"/>
+      </w:pPr>
       <w:r>
+        <w:rPr>
+          <w:rFonts w:ascii="Courier New" w:hAnsi="Courier New"/>
+          <w:sz w:val="20"/>
+        </w:rPr>
         <w:t>D. \(x = 0\) hoặc \(x = 5\)</w:t>
       </w:r>
     </w:p>
     <w:p/>
     <w:p>
-      <w:r>
-        <w:t>Câu 7. [DUNG/SAI] Cho hàm số \(f(x) = x^2 - 4\), xác định đúng/sai:</w:t>
-      </w:r>
-    </w:p>
-    <w:p>
-      <w:r>
-        <w:t>A. \(f(0) = -4\) (đúng)</w:t>
-      </w:r>
-    </w:p>
-    <w:p>
-      <w:r>
-        <w:t>B. \(f(2) = 0\) (đúng)</w:t>
-      </w:r>
-    </w:p>
-    <w:p>
-      <w:r>
-        <w:t>C. \(f(-2) = 4\) (sai)</w:t>
-      </w:r>
-    </w:p>
-    <w:p>
-      <w:r>
-        <w:t>D. Hàm số đạt cực tiểu tại \(x = 0\) (đúng)</w:t>
-      </w:r>
-    </w:p>
-    <w:p/>
-    <w:p>
+      <w:pPr>
+        <w:ind w:left="360"/>
+      </w:pPr>
       <w:r>
         <w:rPr>
           <w:b/>
@@ -529,380 +1009,933 @@
         <w:t>Bảng ký hiệu LaTeX thường dùng:</w:t>
       </w:r>
     </w:p>
+    <w:p/>
     <w:p>
+      <w:pPr>
+        <w:ind w:left="540"/>
+        <w:shd w:val="clear" w:color="auto" w:fill="F5F5F5"/>
+      </w:pPr>
       <w:r>
-        <w:t xml:space="preserve">   \(\frac{a}{b}\)   --&gt;   phân số</w:t>
+        <w:rPr>
+          <w:rFonts w:ascii="Courier New" w:hAnsi="Courier New"/>
+          <w:sz w:val="20"/>
+        </w:rPr>
+        <w:t xml:space="preserve">\(\frac{a}{b}\)                                   </w:t>
+      </w:r>
+      <w:r>
+        <w:rPr>
+          <w:sz w:val="20"/>
+        </w:rPr>
+        <w:t>→  Phân số</w:t>
       </w:r>
     </w:p>
     <w:p>
+      <w:pPr>
+        <w:ind w:left="540"/>
+        <w:shd w:val="clear" w:color="auto" w:fill="F5F5F5"/>
+      </w:pPr>
       <w:r>
-        <w:t xml:space="preserve">   \(\sqrt{x}\)   --&gt;   căn bậc hai</w:t>
+        <w:rPr>
+          <w:rFonts w:ascii="Courier New" w:hAnsi="Courier New"/>
+          <w:sz w:val="20"/>
+        </w:rPr>
+        <w:t xml:space="preserve">\(\dfrac{a}{b}\)                                  </w:t>
+      </w:r>
+      <w:r>
+        <w:rPr>
+          <w:sz w:val="20"/>
+        </w:rPr>
+        <w:t>→  Phân số cỡ lớn (trong display)</w:t>
       </w:r>
     </w:p>
     <w:p>
+      <w:pPr>
+        <w:ind w:left="540"/>
+        <w:shd w:val="clear" w:color="auto" w:fill="F5F5F5"/>
+      </w:pPr>
       <w:r>
-        <w:t xml:space="preserve">   \(\sqrt[n]{x}\)   --&gt;   căn bậc n</w:t>
+        <w:rPr>
+          <w:rFonts w:ascii="Courier New" w:hAnsi="Courier New"/>
+          <w:sz w:val="20"/>
+        </w:rPr>
+        <w:t xml:space="preserve">\(\sqrt{x}\)                                      </w:t>
+      </w:r>
+      <w:r>
+        <w:rPr>
+          <w:sz w:val="20"/>
+        </w:rPr>
+        <w:t>→  Căn bậc hai</w:t>
       </w:r>
     </w:p>
     <w:p>
+      <w:pPr>
+        <w:ind w:left="540"/>
+        <w:shd w:val="clear" w:color="auto" w:fill="F5F5F5"/>
+      </w:pPr>
       <w:r>
-        <w:t xml:space="preserve">   \(x^{2}\)   --&gt;   lũy thừa</w:t>
+        <w:rPr>
+          <w:rFonts w:ascii="Courier New" w:hAnsi="Courier New"/>
+          <w:sz w:val="20"/>
+        </w:rPr>
+        <w:t xml:space="preserve">\(\sqrt[n]{x}\)                                   </w:t>
+      </w:r>
+      <w:r>
+        <w:rPr>
+          <w:sz w:val="20"/>
+        </w:rPr>
+        <w:t>→  Căn bậc n</w:t>
       </w:r>
     </w:p>
     <w:p>
+      <w:pPr>
+        <w:ind w:left="540"/>
+        <w:shd w:val="clear" w:color="auto" w:fill="F5F5F5"/>
+      </w:pPr>
       <w:r>
-        <w:t xml:space="preserve">   \(x_{i}\)   --&gt;   chỉ số dưới</w:t>
+        <w:rPr>
+          <w:rFonts w:ascii="Courier New" w:hAnsi="Courier New"/>
+          <w:sz w:val="20"/>
+        </w:rPr>
+        <w:t xml:space="preserve">\(x^{2}\)                                         </w:t>
+      </w:r>
+      <w:r>
+        <w:rPr>
+          <w:sz w:val="20"/>
+        </w:rPr>
+        <w:t>→  Lũy thừa</w:t>
       </w:r>
     </w:p>
     <w:p>
+      <w:pPr>
+        <w:ind w:left="540"/>
+        <w:shd w:val="clear" w:color="auto" w:fill="F5F5F5"/>
+      </w:pPr>
       <w:r>
-        <w:t xml:space="preserve">   \(\dfrac{a}{b}\)   --&gt;   phân số cỡ lớn</w:t>
+        <w:rPr>
+          <w:rFonts w:ascii="Courier New" w:hAnsi="Courier New"/>
+          <w:sz w:val="20"/>
+        </w:rPr>
+        <w:t xml:space="preserve">\(x_{i}\)                                         </w:t>
+      </w:r>
+      <w:r>
+        <w:rPr>
+          <w:sz w:val="20"/>
+        </w:rPr>
+        <w:t>→  Chỉ số dưới</w:t>
       </w:r>
     </w:p>
     <w:p>
+      <w:pPr>
+        <w:ind w:left="540"/>
+        <w:shd w:val="clear" w:color="auto" w:fill="F5F5F5"/>
+      </w:pPr>
       <w:r>
-        <w:t xml:space="preserve">   \(\sum_{i=1}^{n} i\)   --&gt;   tổng sigma</w:t>
+        <w:rPr>
+          <w:rFonts w:ascii="Courier New" w:hAnsi="Courier New"/>
+          <w:sz w:val="20"/>
+        </w:rPr>
+        <w:t xml:space="preserve">\(\sum_{i=1}^{n} i\)                              </w:t>
+      </w:r>
+      <w:r>
+        <w:rPr>
+          <w:sz w:val="20"/>
+        </w:rPr>
+        <w:t>→  Tổng Sigma</w:t>
       </w:r>
     </w:p>
     <w:p>
+      <w:pPr>
+        <w:ind w:left="540"/>
+        <w:shd w:val="clear" w:color="auto" w:fill="F5F5F5"/>
+      </w:pPr>
       <w:r>
-        <w:t xml:space="preserve">   \(\prod_{i=1}^{n} i\)   --&gt;   tích pi</w:t>
+        <w:rPr>
+          <w:rFonts w:ascii="Courier New" w:hAnsi="Courier New"/>
+          <w:sz w:val="20"/>
+        </w:rPr>
+        <w:t xml:space="preserve">\(\prod_{i=1}^{n} i\)                             </w:t>
+      </w:r>
+      <w:r>
+        <w:rPr>
+          <w:sz w:val="20"/>
+        </w:rPr>
+        <w:t>→  Tích Pi</w:t>
       </w:r>
     </w:p>
     <w:p>
+      <w:pPr>
+        <w:ind w:left="540"/>
+        <w:shd w:val="clear" w:color="auto" w:fill="F5F5F5"/>
+      </w:pPr>
       <w:r>
-        <w:t xml:space="preserve">   \(\int_{a}^{b} f(x)dx\)   --&gt;   tích phân</w:t>
+        <w:rPr>
+          <w:rFonts w:ascii="Courier New" w:hAnsi="Courier New"/>
+          <w:sz w:val="20"/>
+        </w:rPr>
+        <w:t xml:space="preserve">\(\int_{a}^{b} f(x)\,dx\)                         </w:t>
+      </w:r>
+      <w:r>
+        <w:rPr>
+          <w:sz w:val="20"/>
+        </w:rPr>
+        <w:t>→  Tích phân</w:t>
       </w:r>
     </w:p>
     <w:p>
+      <w:pPr>
+        <w:ind w:left="540"/>
+        <w:shd w:val="clear" w:color="auto" w:fill="F5F5F5"/>
+      </w:pPr>
       <w:r>
-        <w:t xml:space="preserve">   \(\lim_{x \to 0} f(x)\)   --&gt;   giới hạn</w:t>
+        <w:rPr>
+          <w:rFonts w:ascii="Courier New" w:hAnsi="Courier New"/>
+          <w:sz w:val="20"/>
+        </w:rPr>
+        <w:t xml:space="preserve">\(\lim_{x \to 0} f(x)\)                           </w:t>
+      </w:r>
+      <w:r>
+        <w:rPr>
+          <w:sz w:val="20"/>
+        </w:rPr>
+        <w:t>→  Giới hạn</w:t>
       </w:r>
     </w:p>
     <w:p>
+      <w:pPr>
+        <w:ind w:left="540"/>
+        <w:shd w:val="clear" w:color="auto" w:fill="F5F5F5"/>
+      </w:pPr>
       <w:r>
-        <w:t xml:space="preserve">   \(\infty\)   --&gt;   vô cực</w:t>
+        <w:rPr>
+          <w:rFonts w:ascii="Courier New" w:hAnsi="Courier New"/>
+          <w:sz w:val="20"/>
+        </w:rPr>
+        <w:t xml:space="preserve">\(\infty\)                                        </w:t>
+      </w:r>
+      <w:r>
+        <w:rPr>
+          <w:sz w:val="20"/>
+        </w:rPr>
+        <w:t>→  Vô cực</w:t>
       </w:r>
     </w:p>
     <w:p>
+      <w:pPr>
+        <w:ind w:left="540"/>
+        <w:shd w:val="clear" w:color="auto" w:fill="F5F5F5"/>
+      </w:pPr>
       <w:r>
-        <w:t xml:space="preserve">   \(\pi, \alpha, \beta, \gamma, \theta\)   --&gt;   chữ Hy Lạp</w:t>
+        <w:rPr>
+          <w:rFonts w:ascii="Courier New" w:hAnsi="Courier New"/>
+          <w:sz w:val="20"/>
+        </w:rPr>
+        <w:t xml:space="preserve">\(\pi,\ \alpha,\ \beta,\ \theta\)                 </w:t>
+      </w:r>
+      <w:r>
+        <w:rPr>
+          <w:sz w:val="20"/>
+        </w:rPr>
+        <w:t>→  Chữ Hy Lạp</w:t>
       </w:r>
     </w:p>
     <w:p>
+      <w:pPr>
+        <w:ind w:left="540"/>
+        <w:shd w:val="clear" w:color="auto" w:fill="F5F5F5"/>
+      </w:pPr>
       <w:r>
-        <w:t xml:space="preserve">   \(\leq, \geq, \neq, \approx\)   --&gt;   so sánh</w:t>
+        <w:rPr>
+          <w:rFonts w:ascii="Courier New" w:hAnsi="Courier New"/>
+          <w:sz w:val="20"/>
+        </w:rPr>
+        <w:t xml:space="preserve">\(\leq,\ \geq,\ \neq,\ \approx\)                  </w:t>
+      </w:r>
+      <w:r>
+        <w:rPr>
+          <w:sz w:val="20"/>
+        </w:rPr>
+        <w:t>→  So sánh</w:t>
       </w:r>
     </w:p>
     <w:p>
+      <w:pPr>
+        <w:ind w:left="540"/>
+        <w:shd w:val="clear" w:color="auto" w:fill="F5F5F5"/>
+      </w:pPr>
       <w:r>
-        <w:t xml:space="preserve">   \(\in, \notin, \subset, \cup, \cap\)   --&gt;   tập hợp</w:t>
+        <w:rPr>
+          <w:rFonts w:ascii="Courier New" w:hAnsi="Courier New"/>
+          <w:sz w:val="20"/>
+        </w:rPr>
+        <w:t xml:space="preserve">\(\in,\ \subset,\ \cup,\ \cap\)                   </w:t>
+      </w:r>
+      <w:r>
+        <w:rPr>
+          <w:sz w:val="20"/>
+        </w:rPr>
+        <w:t>→  Tập hợp</w:t>
       </w:r>
     </w:p>
     <w:p>
+      <w:pPr>
+        <w:ind w:left="540"/>
+        <w:shd w:val="clear" w:color="auto" w:fill="F5F5F5"/>
+      </w:pPr>
       <w:r>
-        <w:t xml:space="preserve">   \(\vec{a}, \overrightarrow{AB}\)   --&gt;   vectơ</w:t>
+        <w:rPr>
+          <w:rFonts w:ascii="Courier New" w:hAnsi="Courier New"/>
+          <w:sz w:val="20"/>
+        </w:rPr>
+        <w:t xml:space="preserve">\(\vec{a},\ \overrightarrow{AB}\)                 </w:t>
+      </w:r>
+      <w:r>
+        <w:rPr>
+          <w:sz w:val="20"/>
+        </w:rPr>
+        <w:t>→  Vectơ</w:t>
       </w:r>
     </w:p>
     <w:p>
+      <w:pPr>
+        <w:ind w:left="540"/>
+        <w:shd w:val="clear" w:color="auto" w:fill="F5F5F5"/>
+      </w:pPr>
       <w:r>
-        <w:t xml:space="preserve">   \(\overline{AB}\)   --&gt;   đoạn thẳng AB</w:t>
+        <w:rPr>
+          <w:rFonts w:ascii="Courier New" w:hAnsi="Courier New"/>
+          <w:sz w:val="20"/>
+        </w:rPr>
+        <w:t xml:space="preserve">\(\overline{AB}\)                                 </w:t>
+      </w:r>
+      <w:r>
+        <w:rPr>
+          <w:sz w:val="20"/>
+        </w:rPr>
+        <w:t>→  Đoạn thẳng</w:t>
       </w:r>
     </w:p>
     <w:p>
+      <w:pPr>
+        <w:ind w:left="540"/>
+        <w:shd w:val="clear" w:color="auto" w:fill="F5F5F5"/>
+      </w:pPr>
       <w:r>
-        <w:t xml:space="preserve">   \(\angle, \triangle\)   --&gt;   góc, tam giác</w:t>
+        <w:rPr>
+          <w:rFonts w:ascii="Courier New" w:hAnsi="Courier New"/>
+          <w:sz w:val="20"/>
+        </w:rPr>
+        <w:t xml:space="preserve">\(\angle,\ \triangle\)                            </w:t>
+      </w:r>
+      <w:r>
+        <w:rPr>
+          <w:sz w:val="20"/>
+        </w:rPr>
+        <w:t>→  Góc, tam giác</w:t>
       </w:r>
     </w:p>
     <w:p>
+      <w:pPr>
+        <w:ind w:left="540"/>
+        <w:shd w:val="clear" w:color="auto" w:fill="F5F5F5"/>
+      </w:pPr>
       <w:r>
-        <w:t xml:space="preserve">   \(\begin{pmatrix} a &amp; b \\ c &amp; d \end{pmatrix}\)   --&gt;   ma trận</w:t>
+        <w:rPr>
+          <w:rFonts w:ascii="Courier New" w:hAnsi="Courier New"/>
+          <w:sz w:val="20"/>
+        </w:rPr>
+        <w:t xml:space="preserve">\(\begin{pmatrix} a &amp; b \\ c &amp; d \end{pmatrix}\)  </w:t>
+      </w:r>
+      <w:r>
+        <w:rPr>
+          <w:sz w:val="20"/>
+        </w:rPr>
+        <w:t>→  Ma trận</w:t>
       </w:r>
     </w:p>
     <w:p/>
     <w:p>
+      <w:pPr>
+        <w:shd w:val="clear" w:color="auto" w:fill="DDEEFF"/>
+      </w:pPr>
       <w:r>
         <w:rPr>
           <w:b/>
-          <w:color w:val="0046B4"/>
+          <w:color w:val="00328C"/>
           <w:sz w:val="24"/>
         </w:rPr>
-        <w:t>E. HIỂN THỊ CODE ([CODE] / [/CODE])</w:t>
+        <w:t xml:space="preserve">  E.  HIỂN THỊ CODE  [CODE] / [/CODE]  </w:t>
       </w:r>
     </w:p>
     <w:p/>
     <w:p>
+      <w:pPr>
+        <w:ind w:left="360"/>
+      </w:pPr>
       <w:r>
         <w:rPr>
           <w:b/>
+          <w:color w:val="B45000"/>
         </w:rPr>
-        <w:t xml:space="preserve">Cú pháp: </w:t>
+        <w:t>◆ Cú pháp:</w:t>
       </w:r>
       <w:r>
-        <w:t>Viết [CODE] trên một dòng riêng, sau đó viết từng dòng code, rồi [/CODE] trên dòng riêng.</w:t>
+        <w:t xml:space="preserve">  Viết [CODE] trên dòng riêng → các dòng code → [/CODE] trên dòng riêng</w:t>
       </w:r>
     </w:p>
     <w:p>
+      <w:pPr>
+        <w:ind w:left="360"/>
+      </w:pPr>
       <w:r>
         <w:rPr>
           <w:b/>
+          <w:color w:val="B45000"/>
         </w:rPr>
-        <w:t xml:space="preserve">Vị trí: </w:t>
+        <w:t>◆ Vị trí:</w:t>
       </w:r>
       <w:r>
-        <w:t>Đặt block code sau dòng câu hỏi (hoặc sau đáp án nếu muốn code trong đáp án).</w:t>
+        <w:t xml:space="preserve">  Đặt block code ngay sau dòng câu hỏi (trước các đáp án)</w:t>
       </w:r>
     </w:p>
     <w:p>
+      <w:pPr>
+        <w:ind w:left="360"/>
+      </w:pPr>
       <w:r>
         <w:rPr>
           <w:b/>
+          <w:color w:val="B45000"/>
         </w:rPr>
-        <w:t xml:space="preserve">Ngôn ngữ: </w:t>
+        <w:t>◆ Ngôn ngữ:</w:t>
       </w:r>
       <w:r>
-        <w:t>Tự động nhận dạng: Python, C++, Java, HTML, CSS, JavaScript, SQL, v.v.</w:t>
-      </w:r>
-    </w:p>
-    <w:p>
-      <w:r>
-        <w:rPr>
-          <w:b/>
-        </w:rPr>
-        <w:t xml:space="preserve">Lưu ý: </w:t>
-      </w:r>
-      <w:r>
-        <w:t>KHÔNG đặt [CODE] ngay sau A. B. C. D. trên cùng dòng — phải là dòng riêng.</w:t>
+        <w:t xml:space="preserve">  Tự động nhận dạng: Python, C++, Java, HTML, CSS, JavaScript, SQL, v.v.</w:t>
       </w:r>
     </w:p>
     <w:p/>
     <w:p>
+      <w:pPr>
+        <w:ind w:left="360"/>
+        <w:shd w:val="clear" w:color="auto" w:fill="FFF3CD"/>
+      </w:pPr>
       <w:r>
+        <w:rPr>
+          <w:color w:val="8C4600"/>
+          <w:sz w:val="22"/>
+        </w:rPr>
+        <w:t>⚠  [CODE] và [/CODE] phải là dòng riêng, không có chữ nào khác trên cùng dòng.</w:t>
+      </w:r>
+    </w:p>
+    <w:p/>
+    <w:p>
+      <w:pPr>
+        <w:ind w:left="540"/>
+        <w:shd w:val="clear" w:color="auto" w:fill="F5F5F5"/>
+      </w:pPr>
+      <w:r>
+        <w:rPr>
+          <w:rFonts w:ascii="Courier New" w:hAnsi="Courier New"/>
+          <w:sz w:val="20"/>
+        </w:rPr>
         <w:t>Câu 8. Xét đoạn code Python sau, kết quả in ra là gì?</w:t>
       </w:r>
     </w:p>
     <w:p>
+      <w:pPr>
+        <w:ind w:left="540"/>
+        <w:shd w:val="clear" w:color="auto" w:fill="F5F5F5"/>
+      </w:pPr>
       <w:r>
+        <w:rPr>
+          <w:rFonts w:ascii="Courier New" w:hAnsi="Courier New"/>
+          <w:sz w:val="20"/>
+        </w:rPr>
         <w:t>[CODE]</w:t>
       </w:r>
     </w:p>
     <w:p>
+      <w:pPr>
+        <w:ind w:left="540"/>
+        <w:shd w:val="clear" w:color="auto" w:fill="F5F5F5"/>
+      </w:pPr>
       <w:r>
+        <w:rPr>
+          <w:rFonts w:ascii="Courier New" w:hAnsi="Courier New"/>
+          <w:sz w:val="20"/>
+        </w:rPr>
         <w:t>x = 10</w:t>
       </w:r>
     </w:p>
     <w:p>
+      <w:pPr>
+        <w:ind w:left="540"/>
+        <w:shd w:val="clear" w:color="auto" w:fill="F5F5F5"/>
+      </w:pPr>
       <w:r>
+        <w:rPr>
+          <w:rFonts w:ascii="Courier New" w:hAnsi="Courier New"/>
+          <w:sz w:val="20"/>
+        </w:rPr>
         <w:t>y = 3</w:t>
       </w:r>
     </w:p>
     <w:p>
+      <w:pPr>
+        <w:ind w:left="540"/>
+        <w:shd w:val="clear" w:color="auto" w:fill="F5F5F5"/>
+      </w:pPr>
       <w:r>
+        <w:rPr>
+          <w:rFonts w:ascii="Courier New" w:hAnsi="Courier New"/>
+          <w:sz w:val="20"/>
+        </w:rPr>
         <w:t>print(x // y)</w:t>
       </w:r>
     </w:p>
     <w:p>
+      <w:pPr>
+        <w:ind w:left="540"/>
+        <w:shd w:val="clear" w:color="auto" w:fill="F5F5F5"/>
+      </w:pPr>
       <w:r>
+        <w:rPr>
+          <w:rFonts w:ascii="Courier New" w:hAnsi="Courier New"/>
+          <w:sz w:val="20"/>
+        </w:rPr>
         <w:t>[/CODE]</w:t>
       </w:r>
     </w:p>
     <w:p>
+      <w:pPr>
+        <w:ind w:left="540"/>
+        <w:shd w:val="clear" w:color="auto" w:fill="F5F5F5"/>
+      </w:pPr>
       <w:r>
+        <w:rPr>
+          <w:rFonts w:ascii="Courier New" w:hAnsi="Courier New"/>
+          <w:sz w:val="20"/>
+        </w:rPr>
         <w:t>A. 3 *</w:t>
       </w:r>
     </w:p>
     <w:p>
+      <w:pPr>
+        <w:ind w:left="540"/>
+        <w:shd w:val="clear" w:color="auto" w:fill="F5F5F5"/>
+      </w:pPr>
       <w:r>
+        <w:rPr>
+          <w:rFonts w:ascii="Courier New" w:hAnsi="Courier New"/>
+          <w:sz w:val="20"/>
+        </w:rPr>
         <w:t>B. 3.33</w:t>
       </w:r>
     </w:p>
     <w:p>
+      <w:pPr>
+        <w:ind w:left="540"/>
+        <w:shd w:val="clear" w:color="auto" w:fill="F5F5F5"/>
+      </w:pPr>
       <w:r>
+        <w:rPr>
+          <w:rFonts w:ascii="Courier New" w:hAnsi="Courier New"/>
+          <w:sz w:val="20"/>
+        </w:rPr>
         <w:t>C. 4</w:t>
       </w:r>
     </w:p>
     <w:p>
+      <w:pPr>
+        <w:ind w:left="540"/>
+        <w:shd w:val="clear" w:color="auto" w:fill="F5F5F5"/>
+      </w:pPr>
       <w:r>
+        <w:rPr>
+          <w:rFonts w:ascii="Courier New" w:hAnsi="Courier New"/>
+          <w:sz w:val="20"/>
+        </w:rPr>
         <w:t>D. 1</w:t>
       </w:r>
     </w:p>
     <w:p/>
     <w:p>
+      <w:pPr>
+        <w:ind w:left="540"/>
+        <w:shd w:val="clear" w:color="auto" w:fill="F5F5F5"/>
+      </w:pPr>
       <w:r>
+        <w:rPr>
+          <w:rFonts w:ascii="Courier New" w:hAnsi="Courier New"/>
+          <w:sz w:val="20"/>
+        </w:rPr>
         <w:t>Câu 9. Đoạn code C++ sau in ra giá trị gì?</w:t>
       </w:r>
     </w:p>
     <w:p>
+      <w:pPr>
+        <w:ind w:left="540"/>
+        <w:shd w:val="clear" w:color="auto" w:fill="F5F5F5"/>
+      </w:pPr>
       <w:r>
+        <w:rPr>
+          <w:rFonts w:ascii="Courier New" w:hAnsi="Courier New"/>
+          <w:sz w:val="20"/>
+        </w:rPr>
         <w:t>[CODE]</w:t>
       </w:r>
     </w:p>
     <w:p>
+      <w:pPr>
+        <w:ind w:left="540"/>
+        <w:shd w:val="clear" w:color="auto" w:fill="F5F5F5"/>
+      </w:pPr>
       <w:r>
+        <w:rPr>
+          <w:rFonts w:ascii="Courier New" w:hAnsi="Courier New"/>
+          <w:sz w:val="20"/>
+        </w:rPr>
         <w:t>#include &lt;iostream&gt;</w:t>
       </w:r>
     </w:p>
     <w:p>
+      <w:pPr>
+        <w:ind w:left="540"/>
+        <w:shd w:val="clear" w:color="auto" w:fill="F5F5F5"/>
+      </w:pPr>
       <w:r>
+        <w:rPr>
+          <w:rFonts w:ascii="Courier New" w:hAnsi="Courier New"/>
+          <w:sz w:val="20"/>
+        </w:rPr>
         <w:t>using namespace std;</w:t>
       </w:r>
     </w:p>
     <w:p>
+      <w:pPr>
+        <w:ind w:left="540"/>
+        <w:shd w:val="clear" w:color="auto" w:fill="F5F5F5"/>
+      </w:pPr>
       <w:r>
+        <w:rPr>
+          <w:rFonts w:ascii="Courier New" w:hAnsi="Courier New"/>
+          <w:sz w:val="20"/>
+        </w:rPr>
         <w:t>int main() {</w:t>
       </w:r>
     </w:p>
     <w:p>
+      <w:pPr>
+        <w:ind w:left="540"/>
+        <w:shd w:val="clear" w:color="auto" w:fill="F5F5F5"/>
+      </w:pPr>
       <w:r>
+        <w:rPr>
+          <w:rFonts w:ascii="Courier New" w:hAnsi="Courier New"/>
+          <w:sz w:val="20"/>
+        </w:rPr>
         <w:t xml:space="preserve">    int x = 5;</w:t>
       </w:r>
     </w:p>
     <w:p>
+      <w:pPr>
+        <w:ind w:left="540"/>
+        <w:shd w:val="clear" w:color="auto" w:fill="F5F5F5"/>
+      </w:pPr>
       <w:r>
+        <w:rPr>
+          <w:rFonts w:ascii="Courier New" w:hAnsi="Courier New"/>
+          <w:sz w:val="20"/>
+        </w:rPr>
         <w:t xml:space="preserve">    cout &lt;&lt; x * x;</w:t>
       </w:r>
     </w:p>
     <w:p>
+      <w:pPr>
+        <w:ind w:left="540"/>
+        <w:shd w:val="clear" w:color="auto" w:fill="F5F5F5"/>
+      </w:pPr>
       <w:r>
+        <w:rPr>
+          <w:rFonts w:ascii="Courier New" w:hAnsi="Courier New"/>
+          <w:sz w:val="20"/>
+        </w:rPr>
         <w:t>}</w:t>
       </w:r>
     </w:p>
     <w:p>
+      <w:pPr>
+        <w:ind w:left="540"/>
+        <w:shd w:val="clear" w:color="auto" w:fill="F5F5F5"/>
+      </w:pPr>
       <w:r>
+        <w:rPr>
+          <w:rFonts w:ascii="Courier New" w:hAnsi="Courier New"/>
+          <w:sz w:val="20"/>
+        </w:rPr>
         <w:t>[/CODE]</w:t>
       </w:r>
     </w:p>
     <w:p>
+      <w:pPr>
+        <w:ind w:left="540"/>
+        <w:shd w:val="clear" w:color="auto" w:fill="F5F5F5"/>
+      </w:pPr>
       <w:r>
+        <w:rPr>
+          <w:rFonts w:ascii="Courier New" w:hAnsi="Courier New"/>
+          <w:sz w:val="20"/>
+        </w:rPr>
         <w:t>A. 5</w:t>
       </w:r>
     </w:p>
     <w:p>
+      <w:pPr>
+        <w:ind w:left="540"/>
+        <w:shd w:val="clear" w:color="auto" w:fill="F5F5F5"/>
+      </w:pPr>
       <w:r>
+        <w:rPr>
+          <w:rFonts w:ascii="Courier New" w:hAnsi="Courier New"/>
+          <w:sz w:val="20"/>
+        </w:rPr>
         <w:t>B. 10</w:t>
       </w:r>
     </w:p>
     <w:p>
+      <w:pPr>
+        <w:ind w:left="540"/>
+        <w:shd w:val="clear" w:color="auto" w:fill="F5F5F5"/>
+      </w:pPr>
       <w:r>
+        <w:rPr>
+          <w:rFonts w:ascii="Courier New" w:hAnsi="Courier New"/>
+          <w:sz w:val="20"/>
+        </w:rPr>
         <w:t>C. 25 *</w:t>
       </w:r>
     </w:p>
     <w:p>
+      <w:pPr>
+        <w:ind w:left="540"/>
+        <w:shd w:val="clear" w:color="auto" w:fill="F5F5F5"/>
+      </w:pPr>
       <w:r>
+        <w:rPr>
+          <w:rFonts w:ascii="Courier New" w:hAnsi="Courier New"/>
+          <w:sz w:val="20"/>
+        </w:rPr>
         <w:t>D. 55</w:t>
       </w:r>
     </w:p>
     <w:p/>
     <w:p>
+      <w:pPr>
+        <w:shd w:val="clear" w:color="auto" w:fill="DDEEFF"/>
+      </w:pPr>
       <w:r>
-        <w:t>Câu 10. [MULTI] Xét đoạn HTML sau, khẳng định nào đúng?</w:t>
+        <w:rPr>
+          <w:b/>
+          <w:color w:val="00328C"/>
+          <w:sz w:val="24"/>
+        </w:rPr>
+        <w:t xml:space="preserve">  F.  VÍ DỤ KẾT HỢP NHIỀU TÍNH NĂNG  </w:t>
+      </w:r>
+    </w:p>
+    <w:p/>
+    <w:p>
+      <w:pPr>
+        <w:ind w:left="540"/>
+        <w:shd w:val="clear" w:color="auto" w:fill="F5F5F5"/>
+      </w:pPr>
+      <w:r>
+        <w:rPr>
+          <w:rFonts w:ascii="Courier New" w:hAnsi="Courier New"/>
+          <w:sz w:val="20"/>
+        </w:rPr>
+        <w:t>Câu 10. [MULTI] Cho \(f(x) = x^2\). Xét đoạn code Python tính f(3):</w:t>
       </w:r>
     </w:p>
     <w:p>
+      <w:pPr>
+        <w:ind w:left="540"/>
+        <w:shd w:val="clear" w:color="auto" w:fill="F5F5F5"/>
+      </w:pPr>
       <w:r>
+        <w:rPr>
+          <w:rFonts w:ascii="Courier New" w:hAnsi="Courier New"/>
+          <w:sz w:val="20"/>
+        </w:rPr>
         <w:t>[CODE]</w:t>
       </w:r>
     </w:p>
     <w:p>
+      <w:pPr>
+        <w:ind w:left="540"/>
+        <w:shd w:val="clear" w:color="auto" w:fill="F5F5F5"/>
+      </w:pPr>
       <w:r>
-        <w:t>&lt;div class="box"&gt;</w:t>
+        <w:rPr>
+          <w:rFonts w:ascii="Courier New" w:hAnsi="Courier New"/>
+          <w:sz w:val="20"/>
+        </w:rPr>
+        <w:t>def f(x):</w:t>
       </w:r>
     </w:p>
     <w:p>
+      <w:pPr>
+        <w:ind w:left="540"/>
+        <w:shd w:val="clear" w:color="auto" w:fill="F5F5F5"/>
+      </w:pPr>
       <w:r>
-        <w:t xml:space="preserve">  &lt;p&gt;Hello World&lt;/p&gt;</w:t>
+        <w:rPr>
+          <w:rFonts w:ascii="Courier New" w:hAnsi="Courier New"/>
+          <w:sz w:val="20"/>
+        </w:rPr>
+        <w:t xml:space="preserve">    return x ** 2</w:t>
       </w:r>
     </w:p>
     <w:p>
+      <w:pPr>
+        <w:ind w:left="540"/>
+        <w:shd w:val="clear" w:color="auto" w:fill="F5F5F5"/>
+      </w:pPr>
       <w:r>
-        <w:t>&lt;/div&gt;</w:t>
+        <w:rPr>
+          <w:rFonts w:ascii="Courier New" w:hAnsi="Courier New"/>
+          <w:sz w:val="20"/>
+        </w:rPr>
+        <w:t>print(f(3))</w:t>
       </w:r>
     </w:p>
     <w:p>
+      <w:pPr>
+        <w:ind w:left="540"/>
+        <w:shd w:val="clear" w:color="auto" w:fill="F5F5F5"/>
+      </w:pPr>
       <w:r>
+        <w:rPr>
+          <w:rFonts w:ascii="Courier New" w:hAnsi="Courier New"/>
+          <w:sz w:val="20"/>
+        </w:rPr>
         <w:t>[/CODE]</w:t>
       </w:r>
     </w:p>
     <w:p>
+      <w:pPr>
+        <w:ind w:left="540"/>
+        <w:shd w:val="clear" w:color="auto" w:fill="F5F5F5"/>
+      </w:pPr>
       <w:r>
-        <w:t>A. Thẻ div chứa thẻ p *</w:t>
+        <w:rPr>
+          <w:rFonts w:ascii="Courier New" w:hAnsi="Courier New"/>
+          <w:sz w:val="20"/>
+        </w:rPr>
+        <w:t>A. Kết quả in ra là 9 *</w:t>
       </w:r>
     </w:p>
     <w:p>
+      <w:pPr>
+        <w:ind w:left="540"/>
+        <w:shd w:val="clear" w:color="auto" w:fill="F5F5F5"/>
+      </w:pPr>
       <w:r>
-        <w:t>B. Thuộc tính class có giá trị "box" *</w:t>
+        <w:rPr>
+          <w:rFonts w:ascii="Courier New" w:hAnsi="Courier New"/>
+          <w:sz w:val="20"/>
+        </w:rPr>
+        <w:t>B. Hàm f tính bình phương của x *</w:t>
       </w:r>
     </w:p>
     <w:p>
+      <w:pPr>
+        <w:ind w:left="540"/>
+        <w:shd w:val="clear" w:color="auto" w:fill="F5F5F5"/>
+      </w:pPr>
       <w:r>
-        <w:t>C. Thẻ p không cần đóng</w:t>
+        <w:rPr>
+          <w:rFonts w:ascii="Courier New" w:hAnsi="Courier New"/>
+          <w:sz w:val="20"/>
+        </w:rPr>
+        <w:t>C. Kết quả in ra là 6</w:t>
       </w:r>
     </w:p>
     <w:p>
+      <w:pPr>
+        <w:ind w:left="540"/>
+        <w:shd w:val="clear" w:color="auto" w:fill="F5F5F5"/>
+      </w:pPr>
       <w:r>
-        <w:t>D. Đây là HTML5 hợp lệ *</w:t>
+        <w:rPr>
+          <w:rFonts w:ascii="Courier New" w:hAnsi="Courier New"/>
+          <w:sz w:val="20"/>
+        </w:rPr>
+        <w:t>D. x ** 2 tương đương \(x^2\) trong toán học *</w:t>
       </w:r>
     </w:p>
     <w:p/>
     <w:p>
+      <w:pPr>
+        <w:ind w:left="540"/>
+        <w:shd w:val="clear" w:color="auto" w:fill="F5F5F5"/>
+      </w:pPr>
       <w:r>
         <w:rPr>
-          <w:b/>
-          <w:color w:val="0046B4"/>
-          <w:sz w:val="24"/>
+          <w:rFonts w:ascii="Courier New" w:hAnsi="Courier New"/>
+          <w:sz w:val="20"/>
         </w:rPr>
-        <w:t>F. VÍ DỤ KẾT HỢP NHIỀU TÍNH NĂNG</w:t>
-      </w:r>
-    </w:p>
-    <w:p/>
-    <w:p>
-      <w:r>
-        <w:t>Câu 11. [MULTI] Cho \(f(x) = x^2\). Xét đoạn code Python tính f(3):</w:t>
+        <w:t>Câu 11. [DUNG/SAI] Cho \(f(x) = x^2 - 4\), xác định đúng/sai:</w:t>
       </w:r>
     </w:p>
     <w:p>
+      <w:pPr>
+        <w:ind w:left="540"/>
+        <w:shd w:val="clear" w:color="auto" w:fill="F5F5F5"/>
+      </w:pPr>
       <w:r>
-        <w:t>[CODE]</w:t>
+        <w:rPr>
+          <w:rFonts w:ascii="Courier New" w:hAnsi="Courier New"/>
+          <w:sz w:val="20"/>
+        </w:rPr>
+        <w:t>A. \(f(0) = -4\) (đúng)</w:t>
       </w:r>
     </w:p>
     <w:p>
+      <w:pPr>
+        <w:ind w:left="540"/>
+        <w:shd w:val="clear" w:color="auto" w:fill="F5F5F5"/>
+      </w:pPr>
       <w:r>
-        <w:t>def f(x):</w:t>
+        <w:rPr>
+          <w:rFonts w:ascii="Courier New" w:hAnsi="Courier New"/>
+          <w:sz w:val="20"/>
+        </w:rPr>
+        <w:t>B. \(f(2) = 0\) (đúng)</w:t>
       </w:r>
     </w:p>
     <w:p>
+      <w:pPr>
+        <w:ind w:left="540"/>
+        <w:shd w:val="clear" w:color="auto" w:fill="F5F5F5"/>
+      </w:pPr>
       <w:r>
-        <w:t xml:space="preserve">    return x ** 2</w:t>
+        <w:rPr>
+          <w:rFonts w:ascii="Courier New" w:hAnsi="Courier New"/>
+          <w:sz w:val="20"/>
+        </w:rPr>
+        <w:t>C. \(f(-2) = 4\) (sai)</w:t>
       </w:r>
     </w:p>
     <w:p>
+      <w:pPr>
+        <w:ind w:left="540"/>
+        <w:shd w:val="clear" w:color="auto" w:fill="F5F5F5"/>
+      </w:pPr>
       <w:r>
-        <w:t>print(f(3))</w:t>
-      </w:r>
-    </w:p>
-    <w:p>
-      <w:r>
-        <w:t>[/CODE]</w:t>
-      </w:r>
-    </w:p>
-    <w:p>
-      <w:r>
-        <w:t>A. Kết quả in ra là 9 *</w:t>
-      </w:r>
-    </w:p>
-    <w:p>
-      <w:r>
-        <w:t>B. Hàm f tính bình phương của x *</w:t>
-      </w:r>
-    </w:p>
-    <w:p>
-      <w:r>
-        <w:t>C. Kết quả in ra là 6</w:t>
-      </w:r>
-    </w:p>
-    <w:p>
-      <w:r>
-        <w:t>D. x ** 2 tương đương \(x^2\) trong toán học *</w:t>
+        <w:rPr>
+          <w:rFonts w:ascii="Courier New" w:hAnsi="Courier New"/>
+          <w:sz w:val="20"/>
+        </w:rPr>
+        <w:t>D. Hàm số đạt cực tiểu tại \(x = 0\) (đúng)</w:t>
       </w:r>
     </w:p>
     <w:p/>

</xml_diff>

<commit_message>
feat: tách hướng dẫn và câu hỏi mẫu thành 2 trang riêng
- Trang 1: hướng dẫn thuần túy, không có Câu N. hay A. B. -> không bị import nhầm
- Trang 2: 11 câu hỏi mẫu thật, import được bình thường
- Phần hướng dẫn dùng icon ◆ ⚠ thay vì A. B. để tránh parser nhầm
- Bảng ký hiệu LaTeX dùng Courier New nền xám
- Tiêu đề nhóm câu hỏi mẫu dùng nền xanh nhạt

Co-Authored-By: Claude <noreply@anthropic.com>
</commit_message>
<xml_diff>
--- a/data/mau-cau-hoi.docx
+++ b/data/mau-cau-hoi.docx
@@ -25,7 +25,7 @@
         <w:rPr>
           <w:sz w:val="22"/>
         </w:rPr>
-        <w:t>Hệ thống Trắc Nghiệm LAN</w:t>
+        <w:t>Hệ thống Trắc Nghiệm LAN — File này import được bình thường</w:t>
       </w:r>
     </w:p>
     <w:p/>
@@ -50,7 +50,7 @@
       <w:r>
         <w:rPr>
           <w:b/>
-          <w:color w:val="B45000"/>
+          <w:color w:val="A04600"/>
         </w:rPr>
         <w:t>◆ Dòng câu hỏi:</w:t>
       </w:r>
@@ -65,12 +65,12 @@
       <w:r>
         <w:rPr>
           <w:b/>
-          <w:color w:val="B45000"/>
+          <w:color w:val="A04600"/>
         </w:rPr>
         <w:t>◆ Dòng đáp án:</w:t>
       </w:r>
       <w:r>
-        <w:t xml:space="preserve">  A. ...    B. ...    C. ...    D. ...</w:t>
+        <w:t xml:space="preserve">  Mỗi đáp án trên 1 dòng riêng, bắt đầu bằng  X.  hoặc  X)</w:t>
       </w:r>
     </w:p>
     <w:p>
@@ -80,12 +80,12 @@
       <w:r>
         <w:rPr>
           <w:b/>
-          <w:color w:val="B45000"/>
+          <w:color w:val="A04600"/>
         </w:rPr>
         <w:t>◆ Phân cách câu:</w:t>
       </w:r>
       <w:r>
-        <w:t xml:space="preserve">  Để 1 dòng trắng (Enter) giữa các câu</w:t>
+        <w:t xml:space="preserve">  1 dòng trắng giữa các câu (không bắt buộc nhưng nên có)</w:t>
       </w:r>
     </w:p>
     <w:p/>
@@ -96,12 +96,9 @@
       <w:r>
         <w:rPr>
           <w:b/>
-          <w:color w:val="B45000"/>
+          <w:color w:val="A04600"/>
         </w:rPr>
         <w:t>◆ Prefix câu hỏi được chấp nhận:</w:t>
-      </w:r>
-      <w:r>
-        <w:t xml:space="preserve">  </w:t>
       </w:r>
     </w:p>
     <w:p>
@@ -114,7 +111,7 @@
           <w:rFonts w:ascii="Courier New" w:hAnsi="Courier New"/>
           <w:sz w:val="20"/>
         </w:rPr>
-        <w:t>Câu 1.  Câu 1:  1.  1:      (có hoặc không có chữ "Câu")</w:t>
+        <w:t>Câu 1.   Câu 1:   1.   1:       (có hoặc không có chữ "Câu")</w:t>
       </w:r>
     </w:p>
     <w:p/>
@@ -125,12 +122,9 @@
       <w:r>
         <w:rPr>
           <w:b/>
-          <w:color w:val="B45000"/>
+          <w:color w:val="A04600"/>
         </w:rPr>
         <w:t>◆ Prefix đáp án được chấp nhận:</w:t>
-      </w:r>
-      <w:r>
-        <w:t xml:space="preserve">  </w:t>
       </w:r>
     </w:p>
     <w:p>
@@ -143,7 +137,7 @@
           <w:rFonts w:ascii="Courier New" w:hAnsi="Courier New"/>
           <w:sz w:val="20"/>
         </w:rPr>
-        <w:t>A.  hoặc  A)      (chỉ dùng chữ cái A B C D E...)</w:t>
+        <w:t>X.   hoặc   X)      (X là chữ cái bất kỳ: A B C D E ...)</w:t>
       </w:r>
     </w:p>
     <w:p/>
@@ -154,12 +148,12 @@
       <w:r>
         <w:rPr>
           <w:b/>
-          <w:color w:val="B45000"/>
+          <w:color w:val="A04600"/>
         </w:rPr>
         <w:t>◆ Tối thiểu:</w:t>
       </w:r>
       <w:r>
-        <w:t xml:space="preserve">  Mỗi câu cần ít nhất 2 đáp án. Tối đa không giới hạn.</w:t>
+        <w:t xml:space="preserve">  Mỗi câu cần ít nhất 2 đáp án.</w:t>
       </w:r>
     </w:p>
     <w:p/>
@@ -187,7 +181,7 @@
           <w:color w:val="8C4600"/>
           <w:sz w:val="22"/>
         </w:rPr>
-        <w:t>⚠  KHÔNG dùng tính năng Bullets / Numbering của Word.  Chỉ gõ A. B. C. D. như văn bản thường.</w:t>
+        <w:t>⚠  KHÔNG dùng Bullets / Numbering của Word. Chỉ gõ đáp án như văn bản thường.</w:t>
       </w:r>
     </w:p>
     <w:p>
@@ -200,7 +194,7 @@
           <w:color w:val="8C4600"/>
           <w:sz w:val="22"/>
         </w:rPr>
-        <w:t>⚠  Câu hỏi, mỗi đáp án, [CODE], [/CODE] đều phải là đoạn văn bản riêng (nhấn Enter xuống dòng).</w:t>
+        <w:t>⚠  Câu hỏi, mỗi đáp án, [CODE], [/CODE] đều phải là đoạn văn riêng (nhấn Enter).</w:t>
       </w:r>
     </w:p>
     <w:p>
@@ -213,7 +207,7 @@
           <w:color w:val="8C4600"/>
           <w:sz w:val="22"/>
         </w:rPr>
-        <w:t>⚠  Hình ảnh: Chèn ảnh trực tiếp vào dòng câu hỏi hoặc đáp án trong Word. Ảnh được nhúng tự động khi import.</w:t>
+        <w:t>⚠  Hình ảnh: chèn trực tiếp vào dòng câu hỏi hoặc đáp án — ảnh được nhúng tự động khi import.</w:t>
       </w:r>
     </w:p>
     <w:p>
@@ -226,7 +220,7 @@
           <w:color w:val="8C4600"/>
           <w:sz w:val="22"/>
         </w:rPr>
-        <w:t>⚠  Dòng không bắt đầu bằng "Câu N." hoặc chữ cái + dấu chấm sẽ bị bỏ qua (tiêu đề, mô tả, v.v.).</w:t>
+        <w:t>⚠  Dòng tiêu đề / chú thích không bắt đầu bằng "Câu N." sẽ bị bỏ qua khi import.</w:t>
       </w:r>
     </w:p>
     <w:p/>
@@ -265,12 +259,12 @@
       <w:r>
         <w:rPr>
           <w:b/>
-          <w:color w:val="B45000"/>
+          <w:color w:val="A04600"/>
         </w:rPr>
-        <w:t>◆ Đánh dấu đáp án đúng:</w:t>
+        <w:t>◆ Đánh dấu đúng:</w:t>
       </w:r>
       <w:r>
-        <w:t xml:space="preserve">  Thêm dấu  *  sau đáp án đúng (đúng 1 dấu *)</w:t>
+        <w:t xml:space="preserve">  Thêm  *  sau đáp án đúng  —  hoặc viết  (đúng)  ở cuối</w:t>
       </w:r>
     </w:p>
     <w:p>
@@ -280,225 +274,13 @@
       <w:r>
         <w:rPr>
           <w:b/>
-          <w:color w:val="B45000"/>
+          <w:color w:val="A04600"/>
         </w:rPr>
-        <w:t>◆ Hoặc:</w:t>
+        <w:t>◆ Không đánh dấu gì:</w:t>
       </w:r>
       <w:r>
-        <w:t xml:space="preserve">  Viết  (đúng)  hoặc  (dung)  ở cuối đáp án đúng</w:t>
+        <w:t xml:space="preserve">  Hệ thống tự chọn đáp án đầu tiên (đáp án thứ nhất) làm đúng</w:t>
       </w:r>
-    </w:p>
-    <w:p>
-      <w:pPr>
-        <w:ind w:left="360"/>
-      </w:pPr>
-      <w:r>
-        <w:rPr>
-          <w:b/>
-          <w:color w:val="B45000"/>
-        </w:rPr>
-        <w:t>◆ Mặc định:</w:t>
-      </w:r>
-      <w:r>
-        <w:t xml:space="preserve">  Nếu KHÔNG đánh dấu gì cả → hệ thống tự chọn đáp án A làm đáp án đúng</w:t>
-      </w:r>
-    </w:p>
-    <w:p/>
-    <w:p>
-      <w:pPr>
-        <w:ind w:left="540"/>
-        <w:shd w:val="clear" w:color="auto" w:fill="F5F5F5"/>
-      </w:pPr>
-      <w:r>
-        <w:rPr>
-          <w:rFonts w:ascii="Courier New" w:hAnsi="Courier New"/>
-          <w:sz w:val="20"/>
-        </w:rPr>
-        <w:t>Câu 1. Thủ đô của Việt Nam là thành phố nào?</w:t>
-      </w:r>
-    </w:p>
-    <w:p>
-      <w:pPr>
-        <w:ind w:left="540"/>
-        <w:shd w:val="clear" w:color="auto" w:fill="F5F5F5"/>
-      </w:pPr>
-      <w:r>
-        <w:rPr>
-          <w:rFonts w:ascii="Courier New" w:hAnsi="Courier New"/>
-          <w:sz w:val="20"/>
-        </w:rPr>
-        <w:t>A. TP. Hồ Chí Minh</w:t>
-      </w:r>
-    </w:p>
-    <w:p>
-      <w:pPr>
-        <w:ind w:left="540"/>
-        <w:shd w:val="clear" w:color="auto" w:fill="F5F5F5"/>
-      </w:pPr>
-      <w:r>
-        <w:rPr>
-          <w:rFonts w:ascii="Courier New" w:hAnsi="Courier New"/>
-          <w:sz w:val="20"/>
-        </w:rPr>
-        <w:t>B. Hà Nội *</w:t>
-      </w:r>
-    </w:p>
-    <w:p>
-      <w:pPr>
-        <w:ind w:left="540"/>
-        <w:shd w:val="clear" w:color="auto" w:fill="F5F5F5"/>
-      </w:pPr>
-      <w:r>
-        <w:rPr>
-          <w:rFonts w:ascii="Courier New" w:hAnsi="Courier New"/>
-          <w:sz w:val="20"/>
-        </w:rPr>
-        <w:t>C. Đà Nẵng</w:t>
-      </w:r>
-    </w:p>
-    <w:p>
-      <w:pPr>
-        <w:ind w:left="540"/>
-        <w:shd w:val="clear" w:color="auto" w:fill="F5F5F5"/>
-      </w:pPr>
-      <w:r>
-        <w:rPr>
-          <w:rFonts w:ascii="Courier New" w:hAnsi="Courier New"/>
-          <w:sz w:val="20"/>
-        </w:rPr>
-        <w:t>D. Cần Thơ</w:t>
-      </w:r>
-    </w:p>
-    <w:p/>
-    <w:p>
-      <w:pPr>
-        <w:ind w:left="540"/>
-        <w:shd w:val="clear" w:color="auto" w:fill="F5F5F5"/>
-      </w:pPr>
-      <w:r>
-        <w:rPr>
-          <w:rFonts w:ascii="Courier New" w:hAnsi="Courier New"/>
-          <w:sz w:val="20"/>
-        </w:rPr>
-        <w:t>Câu 2. Năm nào Việt Nam thống nhất đất nước?</w:t>
-      </w:r>
-    </w:p>
-    <w:p>
-      <w:pPr>
-        <w:ind w:left="540"/>
-        <w:shd w:val="clear" w:color="auto" w:fill="F5F5F5"/>
-      </w:pPr>
-      <w:r>
-        <w:rPr>
-          <w:rFonts w:ascii="Courier New" w:hAnsi="Courier New"/>
-          <w:sz w:val="20"/>
-        </w:rPr>
-        <w:t>A. 1954</w:t>
-      </w:r>
-    </w:p>
-    <w:p>
-      <w:pPr>
-        <w:ind w:left="540"/>
-        <w:shd w:val="clear" w:color="auto" w:fill="F5F5F5"/>
-      </w:pPr>
-      <w:r>
-        <w:rPr>
-          <w:rFonts w:ascii="Courier New" w:hAnsi="Courier New"/>
-          <w:sz w:val="20"/>
-        </w:rPr>
-        <w:t>B. 1968</w:t>
-      </w:r>
-    </w:p>
-    <w:p>
-      <w:pPr>
-        <w:ind w:left="540"/>
-        <w:shd w:val="clear" w:color="auto" w:fill="F5F5F5"/>
-      </w:pPr>
-      <w:r>
-        <w:rPr>
-          <w:rFonts w:ascii="Courier New" w:hAnsi="Courier New"/>
-          <w:sz w:val="20"/>
-        </w:rPr>
-        <w:t>C. 1975 (đúng)</w:t>
-      </w:r>
-    </w:p>
-    <w:p>
-      <w:pPr>
-        <w:ind w:left="540"/>
-        <w:shd w:val="clear" w:color="auto" w:fill="F5F5F5"/>
-      </w:pPr>
-      <w:r>
-        <w:rPr>
-          <w:rFonts w:ascii="Courier New" w:hAnsi="Courier New"/>
-          <w:sz w:val="20"/>
-        </w:rPr>
-        <w:t>D. 1986</w:t>
-      </w:r>
-    </w:p>
-    <w:p/>
-    <w:p>
-      <w:pPr>
-        <w:ind w:left="540"/>
-        <w:shd w:val="clear" w:color="auto" w:fill="F5F5F5"/>
-      </w:pPr>
-      <w:r>
-        <w:rPr>
-          <w:rFonts w:ascii="Courier New" w:hAnsi="Courier New"/>
-          <w:sz w:val="20"/>
-        </w:rPr>
-        <w:t>Câu 3. Đây là ví dụ KHÔNG đánh dấu → hệ thống chọn A làm đúng</w:t>
-      </w:r>
-    </w:p>
-    <w:p>
-      <w:pPr>
-        <w:ind w:left="540"/>
-        <w:shd w:val="clear" w:color="auto" w:fill="F5F5F5"/>
-      </w:pPr>
-      <w:r>
-        <w:rPr>
-          <w:rFonts w:ascii="Courier New" w:hAnsi="Courier New"/>
-          <w:sz w:val="20"/>
-        </w:rPr>
-        <w:t>A. Đáp án này được chọn tự động là ĐÚNG</w:t>
-      </w:r>
-    </w:p>
-    <w:p>
-      <w:pPr>
-        <w:ind w:left="540"/>
-        <w:shd w:val="clear" w:color="auto" w:fill="F5F5F5"/>
-      </w:pPr>
-      <w:r>
-        <w:rPr>
-          <w:rFonts w:ascii="Courier New" w:hAnsi="Courier New"/>
-          <w:sz w:val="20"/>
-        </w:rPr>
-        <w:t>B. Đáp án sai</w:t>
-      </w:r>
-    </w:p>
-    <w:p>
-      <w:pPr>
-        <w:ind w:left="540"/>
-        <w:shd w:val="clear" w:color="auto" w:fill="F5F5F5"/>
-      </w:pPr>
-      <w:r>
-        <w:rPr>
-          <w:rFonts w:ascii="Courier New" w:hAnsi="Courier New"/>
-          <w:sz w:val="20"/>
-        </w:rPr>
-        <w:t>C. Đáp án sai</w:t>
-      </w:r>
-    </w:p>
-    <w:p/>
-    <w:p>
-      <w:pPr>
-        <w:pBdr>
-          <w:top w:val="single" w:sz="4" w:space="4" w:color="CCCCCC"/>
-          <w:left w:val="single" w:sz="4" w:space="4" w:color="CCCCCC"/>
-          <w:bottom w:val="single" w:sz="4" w:space="4" w:color="CCCCCC"/>
-          <w:right w:val="single" w:sz="4" w:space="4" w:color="CCCCCC"/>
-        </w:pBdr>
-      </w:pPr>
-      <w:r/>
     </w:p>
     <w:p/>
     <w:p>
@@ -511,7 +293,7 @@
           <w:color w:val="007800"/>
           <w:sz w:val="22"/>
         </w:rPr>
-        <w:t xml:space="preserve">  ▸  LOẠI 2.  Nhiều đáp án đúng  [MULTI]  </w:t>
+        <w:t xml:space="preserve">  ▸  LOẠI 2.  Nhiều đáp án đúng  →  thêm [MULTI] vào đầu câu hỏi  </w:t>
       </w:r>
     </w:p>
     <w:p/>
@@ -522,12 +304,12 @@
       <w:r>
         <w:rPr>
           <w:b/>
-          <w:color w:val="B45000"/>
+          <w:color w:val="A04600"/>
         </w:rPr>
-        <w:t>◆ Tag:</w:t>
+        <w:t>◆ Tag chấp nhận:</w:t>
       </w:r>
       <w:r>
-        <w:t xml:space="preserve">  Thêm  [MULTI]  vào đầu câu hỏi (không phân biệt hoa thường)</w:t>
+        <w:t xml:space="preserve">  [MULTI]  [multi]  (không phân biệt hoa thường)</w:t>
       </w:r>
     </w:p>
     <w:p>
@@ -537,104 +319,13 @@
       <w:r>
         <w:rPr>
           <w:b/>
-          <w:color w:val="B45000"/>
+          <w:color w:val="A04600"/>
         </w:rPr>
         <w:t>◆ Đánh dấu:</w:t>
       </w:r>
       <w:r>
-        <w:t xml:space="preserve">  Thêm  *  vào cuối MỖI đáp án đúng (ít nhất 2 dấu *)</w:t>
+        <w:t xml:space="preserve">  Thêm  *  sau MỖI đáp án đúng — cần ít nhất 2 dấu *</w:t>
       </w:r>
-    </w:p>
-    <w:p/>
-    <w:p>
-      <w:pPr>
-        <w:ind w:left="540"/>
-        <w:shd w:val="clear" w:color="auto" w:fill="F5F5F5"/>
-      </w:pPr>
-      <w:r>
-        <w:rPr>
-          <w:rFonts w:ascii="Courier New" w:hAnsi="Courier New"/>
-          <w:sz w:val="20"/>
-        </w:rPr>
-        <w:t>Câu 4. [MULTI] Chọn các thành phố trực thuộc Trung ương của Việt Nam:</w:t>
-      </w:r>
-    </w:p>
-    <w:p>
-      <w:pPr>
-        <w:ind w:left="540"/>
-        <w:shd w:val="clear" w:color="auto" w:fill="F5F5F5"/>
-      </w:pPr>
-      <w:r>
-        <w:rPr>
-          <w:rFonts w:ascii="Courier New" w:hAnsi="Courier New"/>
-          <w:sz w:val="20"/>
-        </w:rPr>
-        <w:t>A. Hà Nội *</w:t>
-      </w:r>
-    </w:p>
-    <w:p>
-      <w:pPr>
-        <w:ind w:left="540"/>
-        <w:shd w:val="clear" w:color="auto" w:fill="F5F5F5"/>
-      </w:pPr>
-      <w:r>
-        <w:rPr>
-          <w:rFonts w:ascii="Courier New" w:hAnsi="Courier New"/>
-          <w:sz w:val="20"/>
-        </w:rPr>
-        <w:t>B. Nghệ An</w:t>
-      </w:r>
-    </w:p>
-    <w:p>
-      <w:pPr>
-        <w:ind w:left="540"/>
-        <w:shd w:val="clear" w:color="auto" w:fill="F5F5F5"/>
-      </w:pPr>
-      <w:r>
-        <w:rPr>
-          <w:rFonts w:ascii="Courier New" w:hAnsi="Courier New"/>
-          <w:sz w:val="20"/>
-        </w:rPr>
-        <w:t>C. TP. Hồ Chí Minh *</w:t>
-      </w:r>
-    </w:p>
-    <w:p>
-      <w:pPr>
-        <w:ind w:left="540"/>
-        <w:shd w:val="clear" w:color="auto" w:fill="F5F5F5"/>
-      </w:pPr>
-      <w:r>
-        <w:rPr>
-          <w:rFonts w:ascii="Courier New" w:hAnsi="Courier New"/>
-          <w:sz w:val="20"/>
-        </w:rPr>
-        <w:t>D. Đà Nẵng *</w:t>
-      </w:r>
-    </w:p>
-    <w:p>
-      <w:pPr>
-        <w:ind w:left="540"/>
-        <w:shd w:val="clear" w:color="auto" w:fill="F5F5F5"/>
-      </w:pPr>
-      <w:r>
-        <w:rPr>
-          <w:rFonts w:ascii="Courier New" w:hAnsi="Courier New"/>
-          <w:sz w:val="20"/>
-        </w:rPr>
-        <w:t>E. Cần Thơ *</w:t>
-      </w:r>
-    </w:p>
-    <w:p/>
-    <w:p>
-      <w:pPr>
-        <w:pBdr>
-          <w:top w:val="single" w:sz="4" w:space="4" w:color="CCCCCC"/>
-          <w:left w:val="single" w:sz="4" w:space="4" w:color="CCCCCC"/>
-          <w:bottom w:val="single" w:sz="4" w:space="4" w:color="CCCCCC"/>
-          <w:right w:val="single" w:sz="4" w:space="4" w:color="CCCCCC"/>
-        </w:pBdr>
-      </w:pPr>
-      <w:r/>
     </w:p>
     <w:p/>
     <w:p>
@@ -647,7 +338,7 @@
           <w:color w:val="007800"/>
           <w:sz w:val="22"/>
         </w:rPr>
-        <w:t xml:space="preserve">  ▸  LOẠI 3.  Đúng / Sai  [DUNG/SAI]  </w:t>
+        <w:t xml:space="preserve">  ▸  LOẠI 3.  Đúng / Sai  →  thêm [DUNG/SAI] vào đầu câu hỏi  </w:t>
       </w:r>
     </w:p>
     <w:p/>
@@ -658,12 +349,12 @@
       <w:r>
         <w:rPr>
           <w:b/>
-          <w:color w:val="B45000"/>
+          <w:color w:val="A04600"/>
         </w:rPr>
         <w:t>◆ Tag chấp nhận:</w:t>
       </w:r>
       <w:r>
-        <w:t xml:space="preserve">  [DUNG/SAI]  [ĐÚNG/SAI]  [DUNGSAI]  (không phân biệt hoa thường)</w:t>
+        <w:t xml:space="preserve">  [DUNG/SAI]   [ĐÚNG/SAI]   [DUNGSAI]   (không phân biệt hoa thường)</w:t>
       </w:r>
     </w:p>
     <w:p>
@@ -673,7 +364,7 @@
       <w:r>
         <w:rPr>
           <w:b/>
-          <w:color w:val="B45000"/>
+          <w:color w:val="A04600"/>
         </w:rPr>
         <w:t>◆ Quy tắc:</w:t>
       </w:r>
@@ -689,12 +380,9 @@
       <w:r>
         <w:rPr>
           <w:b/>
-          <w:color w:val="B45000"/>
+          <w:color w:val="A04600"/>
         </w:rPr>
         <w:t>◆ Marker ĐÚNG:</w:t>
-      </w:r>
-      <w:r>
-        <w:t xml:space="preserve">  </w:t>
       </w:r>
     </w:p>
     <w:p>
@@ -710,7 +398,6 @@
         <w:t>(đúng)   (dung)   (Đ)   (đ)   (D)   (d)   (T)   (t)   (Y)   (y)</w:t>
       </w:r>
     </w:p>
-    <w:p/>
     <w:p>
       <w:pPr>
         <w:ind w:left="360"/>
@@ -718,12 +405,9 @@
       <w:r>
         <w:rPr>
           <w:b/>
-          <w:color w:val="B45000"/>
+          <w:color w:val="A04600"/>
         </w:rPr>
         <w:t>◆ Marker SAI:</w:t>
-      </w:r>
-      <w:r>
-        <w:t xml:space="preserve">  </w:t>
       </w:r>
     </w:p>
     <w:p>
@@ -737,72 +421,6 @@
           <w:sz w:val="20"/>
         </w:rPr>
         <w:t>(sai)   (S)   (s)   (F)   (f)   (N)   (n)</w:t>
-      </w:r>
-    </w:p>
-    <w:p/>
-    <w:p>
-      <w:pPr>
-        <w:ind w:left="540"/>
-        <w:shd w:val="clear" w:color="auto" w:fill="F5F5F5"/>
-      </w:pPr>
-      <w:r>
-        <w:rPr>
-          <w:rFonts w:ascii="Courier New" w:hAnsi="Courier New"/>
-          <w:sz w:val="20"/>
-        </w:rPr>
-        <w:t>Câu 5. [DUNG/SAI] Xác định tính đúng/sai của các phát biểu:</w:t>
-      </w:r>
-    </w:p>
-    <w:p>
-      <w:pPr>
-        <w:ind w:left="540"/>
-        <w:shd w:val="clear" w:color="auto" w:fill="F5F5F5"/>
-      </w:pPr>
-      <w:r>
-        <w:rPr>
-          <w:rFonts w:ascii="Courier New" w:hAnsi="Courier New"/>
-          <w:sz w:val="20"/>
-        </w:rPr>
-        <w:t>A. Hà Nội là thủ đô Việt Nam. (đúng)</w:t>
-      </w:r>
-    </w:p>
-    <w:p>
-      <w:pPr>
-        <w:ind w:left="540"/>
-        <w:shd w:val="clear" w:color="auto" w:fill="F5F5F5"/>
-      </w:pPr>
-      <w:r>
-        <w:rPr>
-          <w:rFonts w:ascii="Courier New" w:hAnsi="Courier New"/>
-          <w:sz w:val="20"/>
-        </w:rPr>
-        <w:t>B. Việt Nam không có biên giới với Trung Quốc. (sai)</w:t>
-      </w:r>
-    </w:p>
-    <w:p>
-      <w:pPr>
-        <w:ind w:left="540"/>
-        <w:shd w:val="clear" w:color="auto" w:fill="F5F5F5"/>
-      </w:pPr>
-      <w:r>
-        <w:rPr>
-          <w:rFonts w:ascii="Courier New" w:hAnsi="Courier New"/>
-          <w:sz w:val="20"/>
-        </w:rPr>
-        <w:t>C. Sông Hồng chảy qua Hà Nội. (D)</w:t>
-      </w:r>
-    </w:p>
-    <w:p>
-      <w:pPr>
-        <w:ind w:left="540"/>
-        <w:shd w:val="clear" w:color="auto" w:fill="F5F5F5"/>
-      </w:pPr>
-      <w:r>
-        <w:rPr>
-          <w:rFonts w:ascii="Courier New" w:hAnsi="Courier New"/>
-          <w:sz w:val="20"/>
-        </w:rPr>
-        <w:t>D. Việt Nam có 63 tỉnh thành. (Y)</w:t>
       </w:r>
     </w:p>
     <w:p/>
@@ -827,7 +445,7 @@
       <w:r>
         <w:rPr>
           <w:b/>
-          <w:color w:val="B45000"/>
+          <w:color w:val="A04600"/>
         </w:rPr>
         <w:t>◆ Inline — trong dòng chữ:</w:t>
       </w:r>
@@ -842,7 +460,7 @@
       <w:r>
         <w:rPr>
           <w:b/>
-          <w:color w:val="B45000"/>
+          <w:color w:val="A04600"/>
         </w:rPr>
         <w:t>◆ Display — dòng riêng, căn giữa:</w:t>
       </w:r>
@@ -857,12 +475,24 @@
       <w:r>
         <w:rPr>
           <w:b/>
-          <w:color w:val="B45000"/>
+          <w:color w:val="A04600"/>
         </w:rPr>
         <w:t>◆ Công thức Word (OMML):</w:t>
       </w:r>
       <w:r>
-        <w:t xml:space="preserve">  Chèn công thức bằng Insert &gt; Equation trong Word — cũng được hỗ trợ</w:t>
+        <w:t xml:space="preserve">  Insert &gt; Equation trong Word — cũng được hỗ trợ</w:t>
+      </w:r>
+    </w:p>
+    <w:p/>
+    <w:p>
+      <w:pPr>
+        <w:ind w:left="360"/>
+      </w:pPr>
+      <w:r>
+        <w:rPr>
+          <w:b/>
+        </w:rPr>
+        <w:t>Ký hiệu LaTeX thường dùng:</w:t>
       </w:r>
     </w:p>
     <w:p/>
@@ -876,151 +506,7 @@
           <w:rFonts w:ascii="Courier New" w:hAnsi="Courier New"/>
           <w:sz w:val="20"/>
         </w:rPr>
-        <w:t>Câu 6. Giá trị của \(\sqrt{4} + \sqrt{9}\) bằng bao nhiêu?</w:t>
-      </w:r>
-    </w:p>
-    <w:p>
-      <w:pPr>
-        <w:ind w:left="540"/>
-        <w:shd w:val="clear" w:color="auto" w:fill="F5F5F5"/>
-      </w:pPr>
-      <w:r>
-        <w:rPr>
-          <w:rFonts w:ascii="Courier New" w:hAnsi="Courier New"/>
-          <w:sz w:val="20"/>
-        </w:rPr>
-        <w:t>A. 2</w:t>
-      </w:r>
-    </w:p>
-    <w:p>
-      <w:pPr>
-        <w:ind w:left="540"/>
-        <w:shd w:val="clear" w:color="auto" w:fill="F5F5F5"/>
-      </w:pPr>
-      <w:r>
-        <w:rPr>
-          <w:rFonts w:ascii="Courier New" w:hAnsi="Courier New"/>
-          <w:sz w:val="20"/>
-        </w:rPr>
-        <w:t>B. 3</w:t>
-      </w:r>
-    </w:p>
-    <w:p>
-      <w:pPr>
-        <w:ind w:left="540"/>
-        <w:shd w:val="clear" w:color="auto" w:fill="F5F5F5"/>
-      </w:pPr>
-      <w:r>
-        <w:rPr>
-          <w:rFonts w:ascii="Courier New" w:hAnsi="Courier New"/>
-          <w:sz w:val="20"/>
-        </w:rPr>
-        <w:t>C. 5 *</w:t>
-      </w:r>
-    </w:p>
-    <w:p>
-      <w:pPr>
-        <w:ind w:left="540"/>
-        <w:shd w:val="clear" w:color="auto" w:fill="F5F5F5"/>
-      </w:pPr>
-      <w:r>
-        <w:rPr>
-          <w:rFonts w:ascii="Courier New" w:hAnsi="Courier New"/>
-          <w:sz w:val="20"/>
-        </w:rPr>
-        <w:t>D. 7</w:t>
-      </w:r>
-    </w:p>
-    <w:p/>
-    <w:p>
-      <w:pPr>
-        <w:ind w:left="540"/>
-        <w:shd w:val="clear" w:color="auto" w:fill="F5F5F5"/>
-      </w:pPr>
-      <w:r>
-        <w:rPr>
-          <w:rFonts w:ascii="Courier New" w:hAnsi="Courier New"/>
-          <w:sz w:val="20"/>
-        </w:rPr>
-        <w:t>Câu 7. Nghiệm của phương trình \(x^2 - 5x + 6 = 0\) là:</w:t>
-      </w:r>
-    </w:p>
-    <w:p>
-      <w:pPr>
-        <w:ind w:left="540"/>
-        <w:shd w:val="clear" w:color="auto" w:fill="F5F5F5"/>
-      </w:pPr>
-      <w:r>
-        <w:rPr>
-          <w:rFonts w:ascii="Courier New" w:hAnsi="Courier New"/>
-          <w:sz w:val="20"/>
-        </w:rPr>
-        <w:t>A. \(x = 1\) hoặc \(x = 6\)</w:t>
-      </w:r>
-    </w:p>
-    <w:p>
-      <w:pPr>
-        <w:ind w:left="540"/>
-        <w:shd w:val="clear" w:color="auto" w:fill="F5F5F5"/>
-      </w:pPr>
-      <w:r>
-        <w:rPr>
-          <w:rFonts w:ascii="Courier New" w:hAnsi="Courier New"/>
-          <w:sz w:val="20"/>
-        </w:rPr>
-        <w:t>B. \(x = 2\) hoặc \(x = 3\) *</w:t>
-      </w:r>
-    </w:p>
-    <w:p>
-      <w:pPr>
-        <w:ind w:left="540"/>
-        <w:shd w:val="clear" w:color="auto" w:fill="F5F5F5"/>
-      </w:pPr>
-      <w:r>
-        <w:rPr>
-          <w:rFonts w:ascii="Courier New" w:hAnsi="Courier New"/>
-          <w:sz w:val="20"/>
-        </w:rPr>
-        <w:t>C. \(x = -2\) hoặc \(x = -3\)</w:t>
-      </w:r>
-    </w:p>
-    <w:p>
-      <w:pPr>
-        <w:ind w:left="540"/>
-        <w:shd w:val="clear" w:color="auto" w:fill="F5F5F5"/>
-      </w:pPr>
-      <w:r>
-        <w:rPr>
-          <w:rFonts w:ascii="Courier New" w:hAnsi="Courier New"/>
-          <w:sz w:val="20"/>
-        </w:rPr>
-        <w:t>D. \(x = 0\) hoặc \(x = 5\)</w:t>
-      </w:r>
-    </w:p>
-    <w:p/>
-    <w:p>
-      <w:pPr>
-        <w:ind w:left="360"/>
-      </w:pPr>
-      <w:r>
-        <w:rPr>
-          <w:b/>
-        </w:rPr>
-        <w:t>Bảng ký hiệu LaTeX thường dùng:</w:t>
-      </w:r>
-    </w:p>
-    <w:p/>
-    <w:p>
-      <w:pPr>
-        <w:ind w:left="540"/>
-        <w:shd w:val="clear" w:color="auto" w:fill="F5F5F5"/>
-      </w:pPr>
-      <w:r>
-        <w:rPr>
-          <w:rFonts w:ascii="Courier New" w:hAnsi="Courier New"/>
-          <w:sz w:val="20"/>
-        </w:rPr>
-        <w:t xml:space="preserve">\(\frac{a}{b}\)                                   </w:t>
+        <w:t xml:space="preserve">\(\frac{a}{b}\)                                     </w:t>
       </w:r>
       <w:r>
         <w:rPr>
@@ -1039,13 +525,13 @@
           <w:rFonts w:ascii="Courier New" w:hAnsi="Courier New"/>
           <w:sz w:val="20"/>
         </w:rPr>
-        <w:t xml:space="preserve">\(\dfrac{a}{b}\)                                  </w:t>
+        <w:t xml:space="preserve">\(\dfrac{a}{b}\)                                    </w:t>
       </w:r>
       <w:r>
         <w:rPr>
           <w:sz w:val="20"/>
         </w:rPr>
-        <w:t>→  Phân số cỡ lớn (trong display)</w:t>
+        <w:t>→  Phân số cỡ lớn</w:t>
       </w:r>
     </w:p>
     <w:p>
@@ -1058,7 +544,7 @@
           <w:rFonts w:ascii="Courier New" w:hAnsi="Courier New"/>
           <w:sz w:val="20"/>
         </w:rPr>
-        <w:t xml:space="preserve">\(\sqrt{x}\)                                      </w:t>
+        <w:t xml:space="preserve">\(\sqrt{x}\)                                        </w:t>
       </w:r>
       <w:r>
         <w:rPr>
@@ -1077,7 +563,7 @@
           <w:rFonts w:ascii="Courier New" w:hAnsi="Courier New"/>
           <w:sz w:val="20"/>
         </w:rPr>
-        <w:t xml:space="preserve">\(\sqrt[n]{x}\)                                   </w:t>
+        <w:t xml:space="preserve">\(\sqrt[n]{x}\)                                     </w:t>
       </w:r>
       <w:r>
         <w:rPr>
@@ -1096,7 +582,7 @@
           <w:rFonts w:ascii="Courier New" w:hAnsi="Courier New"/>
           <w:sz w:val="20"/>
         </w:rPr>
-        <w:t xml:space="preserve">\(x^{2}\)                                         </w:t>
+        <w:t xml:space="preserve">\(x^{2}\)                                           </w:t>
       </w:r>
       <w:r>
         <w:rPr>
@@ -1115,7 +601,7 @@
           <w:rFonts w:ascii="Courier New" w:hAnsi="Courier New"/>
           <w:sz w:val="20"/>
         </w:rPr>
-        <w:t xml:space="preserve">\(x_{i}\)                                         </w:t>
+        <w:t xml:space="preserve">\(x_{i}\)                                           </w:t>
       </w:r>
       <w:r>
         <w:rPr>
@@ -1134,7 +620,7 @@
           <w:rFonts w:ascii="Courier New" w:hAnsi="Courier New"/>
           <w:sz w:val="20"/>
         </w:rPr>
-        <w:t xml:space="preserve">\(\sum_{i=1}^{n} i\)                              </w:t>
+        <w:t xml:space="preserve">\(\sum_{i=1}^{n} i\)                                </w:t>
       </w:r>
       <w:r>
         <w:rPr>
@@ -1153,7 +639,7 @@
           <w:rFonts w:ascii="Courier New" w:hAnsi="Courier New"/>
           <w:sz w:val="20"/>
         </w:rPr>
-        <w:t xml:space="preserve">\(\prod_{i=1}^{n} i\)                             </w:t>
+        <w:t xml:space="preserve">\(\prod_{i=1}^{n} i\)                               </w:t>
       </w:r>
       <w:r>
         <w:rPr>
@@ -1172,7 +658,7 @@
           <w:rFonts w:ascii="Courier New" w:hAnsi="Courier New"/>
           <w:sz w:val="20"/>
         </w:rPr>
-        <w:t xml:space="preserve">\(\int_{a}^{b} f(x)\,dx\)                         </w:t>
+        <w:t xml:space="preserve">\(\int_{a}^{b} f(x)\,dx\)                           </w:t>
       </w:r>
       <w:r>
         <w:rPr>
@@ -1191,7 +677,7 @@
           <w:rFonts w:ascii="Courier New" w:hAnsi="Courier New"/>
           <w:sz w:val="20"/>
         </w:rPr>
-        <w:t xml:space="preserve">\(\lim_{x \to 0} f(x)\)                           </w:t>
+        <w:t xml:space="preserve">\(\lim_{x \to 0} f(x)\)                             </w:t>
       </w:r>
       <w:r>
         <w:rPr>
@@ -1210,7 +696,7 @@
           <w:rFonts w:ascii="Courier New" w:hAnsi="Courier New"/>
           <w:sz w:val="20"/>
         </w:rPr>
-        <w:t xml:space="preserve">\(\infty\)                                        </w:t>
+        <w:t xml:space="preserve">\(\infty\)                                          </w:t>
       </w:r>
       <w:r>
         <w:rPr>
@@ -1229,7 +715,7 @@
           <w:rFonts w:ascii="Courier New" w:hAnsi="Courier New"/>
           <w:sz w:val="20"/>
         </w:rPr>
-        <w:t xml:space="preserve">\(\pi,\ \alpha,\ \beta,\ \theta\)                 </w:t>
+        <w:t xml:space="preserve">\(\pi,\ \alpha,\ \beta,\ \theta\)                   </w:t>
       </w:r>
       <w:r>
         <w:rPr>
@@ -1248,7 +734,7 @@
           <w:rFonts w:ascii="Courier New" w:hAnsi="Courier New"/>
           <w:sz w:val="20"/>
         </w:rPr>
-        <w:t xml:space="preserve">\(\leq,\ \geq,\ \neq,\ \approx\)                  </w:t>
+        <w:t xml:space="preserve">\(\leq,\ \geq,\ \neq,\ \approx\)                    </w:t>
       </w:r>
       <w:r>
         <w:rPr>
@@ -1267,7 +753,7 @@
           <w:rFonts w:ascii="Courier New" w:hAnsi="Courier New"/>
           <w:sz w:val="20"/>
         </w:rPr>
-        <w:t xml:space="preserve">\(\in,\ \subset,\ \cup,\ \cap\)                   </w:t>
+        <w:t xml:space="preserve">\(\in,\ \subset,\ \cup,\ \cap\)                     </w:t>
       </w:r>
       <w:r>
         <w:rPr>
@@ -1286,7 +772,7 @@
           <w:rFonts w:ascii="Courier New" w:hAnsi="Courier New"/>
           <w:sz w:val="20"/>
         </w:rPr>
-        <w:t xml:space="preserve">\(\vec{a},\ \overrightarrow{AB}\)                 </w:t>
+        <w:t xml:space="preserve">\(\vec{a},\ \overrightarrow{AB}\)                   </w:t>
       </w:r>
       <w:r>
         <w:rPr>
@@ -1305,13 +791,13 @@
           <w:rFonts w:ascii="Courier New" w:hAnsi="Courier New"/>
           <w:sz w:val="20"/>
         </w:rPr>
-        <w:t xml:space="preserve">\(\overline{AB}\)                                 </w:t>
+        <w:t xml:space="preserve">\(\overline{AB}\)                                   </w:t>
       </w:r>
       <w:r>
         <w:rPr>
           <w:sz w:val="20"/>
         </w:rPr>
-        <w:t>→  Đoạn thẳng</w:t>
+        <w:t>→  Đoạn thẳng AB</w:t>
       </w:r>
     </w:p>
     <w:p>
@@ -1324,7 +810,7 @@
           <w:rFonts w:ascii="Courier New" w:hAnsi="Courier New"/>
           <w:sz w:val="20"/>
         </w:rPr>
-        <w:t xml:space="preserve">\(\angle,\ \triangle\)                            </w:t>
+        <w:t xml:space="preserve">\(\angle,\ \triangle\)                              </w:t>
       </w:r>
       <w:r>
         <w:rPr>
@@ -1343,13 +829,13 @@
           <w:rFonts w:ascii="Courier New" w:hAnsi="Courier New"/>
           <w:sz w:val="20"/>
         </w:rPr>
-        <w:t xml:space="preserve">\(\begin{pmatrix} a &amp; b \\ c &amp; d \end{pmatrix}\)  </w:t>
+        <w:t xml:space="preserve">\(\begin{pmatrix} a &amp; b \\ c &amp; d \end{pmatrix}\)    </w:t>
       </w:r>
       <w:r>
         <w:rPr>
           <w:sz w:val="20"/>
         </w:rPr>
-        <w:t>→  Ma trận</w:t>
+        <w:t>→  Ma trận 2x2</w:t>
       </w:r>
     </w:p>
     <w:p/>
@@ -1374,12 +860,12 @@
       <w:r>
         <w:rPr>
           <w:b/>
-          <w:color w:val="B45000"/>
+          <w:color w:val="A04600"/>
         </w:rPr>
         <w:t>◆ Cú pháp:</w:t>
       </w:r>
       <w:r>
-        <w:t xml:space="preserve">  Viết [CODE] trên dòng riêng → các dòng code → [/CODE] trên dòng riêng</w:t>
+        <w:t xml:space="preserve">  Dòng [CODE]  →  các dòng code  →  dòng [/CODE]</w:t>
       </w:r>
     </w:p>
     <w:p>
@@ -1389,12 +875,12 @@
       <w:r>
         <w:rPr>
           <w:b/>
-          <w:color w:val="B45000"/>
+          <w:color w:val="A04600"/>
         </w:rPr>
         <w:t>◆ Vị trí:</w:t>
       </w:r>
       <w:r>
-        <w:t xml:space="preserve">  Đặt block code ngay sau dòng câu hỏi (trước các đáp án)</w:t>
+        <w:t xml:space="preserve">  Đặt block code ngay sau dòng câu hỏi, trước các đáp án</w:t>
       </w:r>
     </w:p>
     <w:p>
@@ -1404,15 +890,14 @@
       <w:r>
         <w:rPr>
           <w:b/>
-          <w:color w:val="B45000"/>
+          <w:color w:val="A04600"/>
         </w:rPr>
         <w:t>◆ Ngôn ngữ:</w:t>
       </w:r>
       <w:r>
-        <w:t xml:space="preserve">  Tự động nhận dạng: Python, C++, Java, HTML, CSS, JavaScript, SQL, v.v.</w:t>
+        <w:t xml:space="preserve">  Tự động nhận dạng: Python, C++, Java, HTML, CSS, JavaScript, SQL...</w:t>
       </w:r>
     </w:p>
-    <w:p/>
     <w:p>
       <w:pPr>
         <w:ind w:left="360"/>
@@ -1423,307 +908,411 @@
           <w:color w:val="8C4600"/>
           <w:sz w:val="22"/>
         </w:rPr>
-        <w:t>⚠  [CODE] và [/CODE] phải là dòng riêng, không có chữ nào khác trên cùng dòng.</w:t>
+        <w:t>⚠  [CODE] và [/CODE] phải là dòng riêng — không có chữ nào khác trên cùng dòng.</w:t>
+      </w:r>
+    </w:p>
+    <w:p/>
+    <w:p>
+      <w:r>
+        <w:br w:type="page"/>
+      </w:r>
+    </w:p>
+    <w:p>
+      <w:pPr>
+        <w:jc w:val="center"/>
+        <w:shd w:val="clear" w:color="auto" w:fill="003087"/>
+      </w:pPr>
+      <w:r>
+        <w:rPr>
+          <w:b/>
+          <w:color w:val="FFFFFF"/>
+          <w:sz w:val="26"/>
+        </w:rPr>
+        <w:t xml:space="preserve">  CÁC CÂU HỎI MẪU  </w:t>
       </w:r>
     </w:p>
     <w:p/>
     <w:p>
       <w:pPr>
-        <w:ind w:left="540"/>
-        <w:shd w:val="clear" w:color="auto" w:fill="F5F5F5"/>
+        <w:shd w:val="clear" w:color="auto" w:fill="DDEEFF"/>
       </w:pPr>
       <w:r>
         <w:rPr>
-          <w:rFonts w:ascii="Courier New" w:hAnsi="Courier New"/>
-          <w:sz w:val="20"/>
+          <w:b/>
         </w:rPr>
-        <w:t>Câu 8. Xét đoạn code Python sau, kết quả in ra là gì?</w:t>
+        <w:t xml:space="preserve">  Loại 1 — Một đáp án đúng  </w:t>
+      </w:r>
+    </w:p>
+    <w:p/>
+    <w:p>
+      <w:r>
+        <w:t>Câu 1. Thủ đô của Việt Nam là thành phố nào?</w:t>
       </w:r>
     </w:p>
     <w:p>
+      <w:r>
+        <w:t>A. TP. Hồ Chí Minh</w:t>
+      </w:r>
+    </w:p>
+    <w:p>
+      <w:r>
+        <w:t>B. Hà Nội *</w:t>
+      </w:r>
+    </w:p>
+    <w:p>
+      <w:r>
+        <w:t>C. Đà Nẵng</w:t>
+      </w:r>
+    </w:p>
+    <w:p>
+      <w:r>
+        <w:t>D. Cần Thơ</w:t>
+      </w:r>
+    </w:p>
+    <w:p/>
+    <w:p>
+      <w:r>
+        <w:t>Câu 2. Năm nào Việt Nam thống nhất đất nước?</w:t>
+      </w:r>
+    </w:p>
+    <w:p>
+      <w:r>
+        <w:t>A. 1954</w:t>
+      </w:r>
+    </w:p>
+    <w:p>
+      <w:r>
+        <w:t>B. 1968</w:t>
+      </w:r>
+    </w:p>
+    <w:p>
+      <w:r>
+        <w:t>C. 1975 (đúng)</w:t>
+      </w:r>
+    </w:p>
+    <w:p>
+      <w:r>
+        <w:t>D. 1986</w:t>
+      </w:r>
+    </w:p>
+    <w:p/>
+    <w:p>
+      <w:r>
+        <w:t>Câu 3. Câu không đánh dấu đáp án đúng → hệ thống tự chọn đáp án đầu tiên làm đúng</w:t>
+      </w:r>
+    </w:p>
+    <w:p>
+      <w:r>
+        <w:t>A. Đây là đáp án đúng (tự động)</w:t>
+      </w:r>
+    </w:p>
+    <w:p>
+      <w:r>
+        <w:t>B. Đáp án sai</w:t>
+      </w:r>
+    </w:p>
+    <w:p>
+      <w:r>
+        <w:t>C. Đáp án sai</w:t>
+      </w:r>
+    </w:p>
+    <w:p/>
+    <w:p>
       <w:pPr>
-        <w:ind w:left="540"/>
-        <w:shd w:val="clear" w:color="auto" w:fill="F5F5F5"/>
+        <w:shd w:val="clear" w:color="auto" w:fill="DDEEFF"/>
       </w:pPr>
       <w:r>
         <w:rPr>
-          <w:rFonts w:ascii="Courier New" w:hAnsi="Courier New"/>
-          <w:sz w:val="20"/>
+          <w:b/>
         </w:rPr>
+        <w:t xml:space="preserve">  Loại 2 — Nhiều đáp án đúng [MULTI]  </w:t>
+      </w:r>
+    </w:p>
+    <w:p/>
+    <w:p>
+      <w:r>
+        <w:t>Câu 4. [MULTI] Chọn các thành phố trực thuộc Trung ương của Việt Nam:</w:t>
+      </w:r>
+    </w:p>
+    <w:p>
+      <w:r>
+        <w:t>A. Hà Nội *</w:t>
+      </w:r>
+    </w:p>
+    <w:p>
+      <w:r>
+        <w:t>B. Nghệ An</w:t>
+      </w:r>
+    </w:p>
+    <w:p>
+      <w:r>
+        <w:t>C. TP. Hồ Chí Minh *</w:t>
+      </w:r>
+    </w:p>
+    <w:p>
+      <w:r>
+        <w:t>D. Đà Nẵng *</w:t>
+      </w:r>
+    </w:p>
+    <w:p>
+      <w:r>
+        <w:t>E. Cần Thơ *</w:t>
+      </w:r>
+    </w:p>
+    <w:p/>
+    <w:p>
+      <w:pPr>
+        <w:shd w:val="clear" w:color="auto" w:fill="DDEEFF"/>
+      </w:pPr>
+      <w:r>
+        <w:rPr>
+          <w:b/>
+        </w:rPr>
+        <w:t xml:space="preserve">  Loại 3 — Đúng / Sai [DUNG/SAI]  </w:t>
+      </w:r>
+    </w:p>
+    <w:p/>
+    <w:p>
+      <w:r>
+        <w:t>Câu 5. [DUNG/SAI] Xác định tính đúng/sai của các phát biểu:</w:t>
+      </w:r>
+    </w:p>
+    <w:p>
+      <w:r>
+        <w:t>A. Hà Nội là thủ đô Việt Nam. (đúng)</w:t>
+      </w:r>
+    </w:p>
+    <w:p>
+      <w:r>
+        <w:t>B. Việt Nam không có biên giới với Trung Quốc. (sai)</w:t>
+      </w:r>
+    </w:p>
+    <w:p>
+      <w:r>
+        <w:t>C. Sông Hồng chảy qua Hà Nội. (D)</w:t>
+      </w:r>
+    </w:p>
+    <w:p>
+      <w:r>
+        <w:t>D. Việt Nam có 63 tỉnh thành. (Y)</w:t>
+      </w:r>
+    </w:p>
+    <w:p/>
+    <w:p>
+      <w:pPr>
+        <w:shd w:val="clear" w:color="auto" w:fill="DDEEFF"/>
+      </w:pPr>
+      <w:r>
+        <w:rPr>
+          <w:b/>
+        </w:rPr>
+        <w:t xml:space="preserve">  Công thức toán (LaTeX)  </w:t>
+      </w:r>
+    </w:p>
+    <w:p/>
+    <w:p>
+      <w:r>
+        <w:t>Câu 6. Giá trị của \(\sqrt{4} + \sqrt{9}\) bằng bao nhiêu?</w:t>
+      </w:r>
+    </w:p>
+    <w:p>
+      <w:r>
+        <w:t>A. 2</w:t>
+      </w:r>
+    </w:p>
+    <w:p>
+      <w:r>
+        <w:t>B. 3</w:t>
+      </w:r>
+    </w:p>
+    <w:p>
+      <w:r>
+        <w:t>C. 5 *</w:t>
+      </w:r>
+    </w:p>
+    <w:p>
+      <w:r>
+        <w:t>D. 7</w:t>
+      </w:r>
+    </w:p>
+    <w:p/>
+    <w:p>
+      <w:r>
+        <w:t>Câu 7. Nghiệm của phương trình \(x^2 - 5x + 6 = 0\) là:</w:t>
+      </w:r>
+    </w:p>
+    <w:p>
+      <w:r>
+        <w:t>A. \(x = 1\) hoặc \(x = 6\)</w:t>
+      </w:r>
+    </w:p>
+    <w:p>
+      <w:r>
+        <w:t>B. \(x = 2\) hoặc \(x = 3\) *</w:t>
+      </w:r>
+    </w:p>
+    <w:p>
+      <w:r>
+        <w:t>C. \(x = -2\) hoặc \(x = -3\)</w:t>
+      </w:r>
+    </w:p>
+    <w:p>
+      <w:r>
+        <w:t>D. \(x = 0\) hoặc \(x = 5\)</w:t>
+      </w:r>
+    </w:p>
+    <w:p/>
+    <w:p>
+      <w:r>
+        <w:t>Câu 8. [DUNG/SAI] Cho hàm số \(f(x) = x^2 - 4\), xác định đúng/sai:</w:t>
+      </w:r>
+    </w:p>
+    <w:p>
+      <w:r>
+        <w:t>A. \(f(0) = -4\) (đúng)</w:t>
+      </w:r>
+    </w:p>
+    <w:p>
+      <w:r>
+        <w:t>B. \(f(2) = 0\) (đúng)</w:t>
+      </w:r>
+    </w:p>
+    <w:p>
+      <w:r>
+        <w:t>C. \(f(-2) = 4\) (sai)</w:t>
+      </w:r>
+    </w:p>
+    <w:p>
+      <w:r>
+        <w:t>D. Hàm số đạt cực tiểu tại \(x = 0\) (đúng)</w:t>
+      </w:r>
+    </w:p>
+    <w:p/>
+    <w:p>
+      <w:pPr>
+        <w:shd w:val="clear" w:color="auto" w:fill="DDEEFF"/>
+      </w:pPr>
+      <w:r>
+        <w:rPr>
+          <w:b/>
+        </w:rPr>
+        <w:t xml:space="preserve">  Hiển thị Code  </w:t>
+      </w:r>
+    </w:p>
+    <w:p/>
+    <w:p>
+      <w:r>
+        <w:t>Câu 9. Xét đoạn code Python sau, kết quả in ra là gì?</w:t>
+      </w:r>
+    </w:p>
+    <w:p>
+      <w:r>
         <w:t>[CODE]</w:t>
       </w:r>
     </w:p>
     <w:p>
-      <w:pPr>
-        <w:ind w:left="540"/>
-        <w:shd w:val="clear" w:color="auto" w:fill="F5F5F5"/>
-      </w:pPr>
       <w:r>
-        <w:rPr>
-          <w:rFonts w:ascii="Courier New" w:hAnsi="Courier New"/>
-          <w:sz w:val="20"/>
-        </w:rPr>
         <w:t>x = 10</w:t>
       </w:r>
     </w:p>
     <w:p>
-      <w:pPr>
-        <w:ind w:left="540"/>
-        <w:shd w:val="clear" w:color="auto" w:fill="F5F5F5"/>
-      </w:pPr>
       <w:r>
-        <w:rPr>
-          <w:rFonts w:ascii="Courier New" w:hAnsi="Courier New"/>
-          <w:sz w:val="20"/>
-        </w:rPr>
         <w:t>y = 3</w:t>
       </w:r>
     </w:p>
     <w:p>
-      <w:pPr>
-        <w:ind w:left="540"/>
-        <w:shd w:val="clear" w:color="auto" w:fill="F5F5F5"/>
-      </w:pPr>
       <w:r>
-        <w:rPr>
-          <w:rFonts w:ascii="Courier New" w:hAnsi="Courier New"/>
-          <w:sz w:val="20"/>
-        </w:rPr>
         <w:t>print(x // y)</w:t>
       </w:r>
     </w:p>
     <w:p>
-      <w:pPr>
-        <w:ind w:left="540"/>
-        <w:shd w:val="clear" w:color="auto" w:fill="F5F5F5"/>
-      </w:pPr>
       <w:r>
-        <w:rPr>
-          <w:rFonts w:ascii="Courier New" w:hAnsi="Courier New"/>
-          <w:sz w:val="20"/>
-        </w:rPr>
         <w:t>[/CODE]</w:t>
       </w:r>
     </w:p>
     <w:p>
-      <w:pPr>
-        <w:ind w:left="540"/>
-        <w:shd w:val="clear" w:color="auto" w:fill="F5F5F5"/>
-      </w:pPr>
       <w:r>
-        <w:rPr>
-          <w:rFonts w:ascii="Courier New" w:hAnsi="Courier New"/>
-          <w:sz w:val="20"/>
-        </w:rPr>
         <w:t>A. 3 *</w:t>
       </w:r>
     </w:p>
     <w:p>
-      <w:pPr>
-        <w:ind w:left="540"/>
-        <w:shd w:val="clear" w:color="auto" w:fill="F5F5F5"/>
-      </w:pPr>
       <w:r>
-        <w:rPr>
-          <w:rFonts w:ascii="Courier New" w:hAnsi="Courier New"/>
-          <w:sz w:val="20"/>
-        </w:rPr>
         <w:t>B. 3.33</w:t>
       </w:r>
     </w:p>
     <w:p>
-      <w:pPr>
-        <w:ind w:left="540"/>
-        <w:shd w:val="clear" w:color="auto" w:fill="F5F5F5"/>
-      </w:pPr>
       <w:r>
-        <w:rPr>
-          <w:rFonts w:ascii="Courier New" w:hAnsi="Courier New"/>
-          <w:sz w:val="20"/>
-        </w:rPr>
         <w:t>C. 4</w:t>
       </w:r>
     </w:p>
     <w:p>
-      <w:pPr>
-        <w:ind w:left="540"/>
-        <w:shd w:val="clear" w:color="auto" w:fill="F5F5F5"/>
-      </w:pPr>
       <w:r>
-        <w:rPr>
-          <w:rFonts w:ascii="Courier New" w:hAnsi="Courier New"/>
-          <w:sz w:val="20"/>
-        </w:rPr>
         <w:t>D. 1</w:t>
       </w:r>
     </w:p>
     <w:p/>
     <w:p>
-      <w:pPr>
-        <w:ind w:left="540"/>
-        <w:shd w:val="clear" w:color="auto" w:fill="F5F5F5"/>
-      </w:pPr>
       <w:r>
-        <w:rPr>
-          <w:rFonts w:ascii="Courier New" w:hAnsi="Courier New"/>
-          <w:sz w:val="20"/>
-        </w:rPr>
-        <w:t>Câu 9. Đoạn code C++ sau in ra giá trị gì?</w:t>
+        <w:t>Câu 10. Đoạn code C++ sau in ra giá trị gì?</w:t>
       </w:r>
     </w:p>
     <w:p>
-      <w:pPr>
-        <w:ind w:left="540"/>
-        <w:shd w:val="clear" w:color="auto" w:fill="F5F5F5"/>
-      </w:pPr>
       <w:r>
-        <w:rPr>
-          <w:rFonts w:ascii="Courier New" w:hAnsi="Courier New"/>
-          <w:sz w:val="20"/>
-        </w:rPr>
         <w:t>[CODE]</w:t>
       </w:r>
     </w:p>
     <w:p>
-      <w:pPr>
-        <w:ind w:left="540"/>
-        <w:shd w:val="clear" w:color="auto" w:fill="F5F5F5"/>
-      </w:pPr>
       <w:r>
-        <w:rPr>
-          <w:rFonts w:ascii="Courier New" w:hAnsi="Courier New"/>
-          <w:sz w:val="20"/>
-        </w:rPr>
         <w:t>#include &lt;iostream&gt;</w:t>
       </w:r>
     </w:p>
     <w:p>
-      <w:pPr>
-        <w:ind w:left="540"/>
-        <w:shd w:val="clear" w:color="auto" w:fill="F5F5F5"/>
-      </w:pPr>
       <w:r>
-        <w:rPr>
-          <w:rFonts w:ascii="Courier New" w:hAnsi="Courier New"/>
-          <w:sz w:val="20"/>
-        </w:rPr>
         <w:t>using namespace std;</w:t>
       </w:r>
     </w:p>
     <w:p>
-      <w:pPr>
-        <w:ind w:left="540"/>
-        <w:shd w:val="clear" w:color="auto" w:fill="F5F5F5"/>
-      </w:pPr>
       <w:r>
-        <w:rPr>
-          <w:rFonts w:ascii="Courier New" w:hAnsi="Courier New"/>
-          <w:sz w:val="20"/>
-        </w:rPr>
         <w:t>int main() {</w:t>
       </w:r>
     </w:p>
     <w:p>
-      <w:pPr>
-        <w:ind w:left="540"/>
-        <w:shd w:val="clear" w:color="auto" w:fill="F5F5F5"/>
-      </w:pPr>
       <w:r>
-        <w:rPr>
-          <w:rFonts w:ascii="Courier New" w:hAnsi="Courier New"/>
-          <w:sz w:val="20"/>
-        </w:rPr>
         <w:t xml:space="preserve">    int x = 5;</w:t>
       </w:r>
     </w:p>
     <w:p>
-      <w:pPr>
-        <w:ind w:left="540"/>
-        <w:shd w:val="clear" w:color="auto" w:fill="F5F5F5"/>
-      </w:pPr>
       <w:r>
-        <w:rPr>
-          <w:rFonts w:ascii="Courier New" w:hAnsi="Courier New"/>
-          <w:sz w:val="20"/>
-        </w:rPr>
         <w:t xml:space="preserve">    cout &lt;&lt; x * x;</w:t>
       </w:r>
     </w:p>
     <w:p>
-      <w:pPr>
-        <w:ind w:left="540"/>
-        <w:shd w:val="clear" w:color="auto" w:fill="F5F5F5"/>
-      </w:pPr>
       <w:r>
-        <w:rPr>
-          <w:rFonts w:ascii="Courier New" w:hAnsi="Courier New"/>
-          <w:sz w:val="20"/>
-        </w:rPr>
         <w:t>}</w:t>
       </w:r>
     </w:p>
     <w:p>
-      <w:pPr>
-        <w:ind w:left="540"/>
-        <w:shd w:val="clear" w:color="auto" w:fill="F5F5F5"/>
-      </w:pPr>
       <w:r>
-        <w:rPr>
-          <w:rFonts w:ascii="Courier New" w:hAnsi="Courier New"/>
-          <w:sz w:val="20"/>
-        </w:rPr>
         <w:t>[/CODE]</w:t>
       </w:r>
     </w:p>
     <w:p>
-      <w:pPr>
-        <w:ind w:left="540"/>
-        <w:shd w:val="clear" w:color="auto" w:fill="F5F5F5"/>
-      </w:pPr>
       <w:r>
-        <w:rPr>
-          <w:rFonts w:ascii="Courier New" w:hAnsi="Courier New"/>
-          <w:sz w:val="20"/>
-        </w:rPr>
         <w:t>A. 5</w:t>
       </w:r>
     </w:p>
     <w:p>
-      <w:pPr>
-        <w:ind w:left="540"/>
-        <w:shd w:val="clear" w:color="auto" w:fill="F5F5F5"/>
-      </w:pPr>
       <w:r>
-        <w:rPr>
-          <w:rFonts w:ascii="Courier New" w:hAnsi="Courier New"/>
-          <w:sz w:val="20"/>
-        </w:rPr>
         <w:t>B. 10</w:t>
       </w:r>
     </w:p>
     <w:p>
-      <w:pPr>
-        <w:ind w:left="540"/>
-        <w:shd w:val="clear" w:color="auto" w:fill="F5F5F5"/>
-      </w:pPr>
       <w:r>
-        <w:rPr>
-          <w:rFonts w:ascii="Courier New" w:hAnsi="Courier New"/>
-          <w:sz w:val="20"/>
-        </w:rPr>
         <w:t>C. 25 *</w:t>
       </w:r>
     </w:p>
     <w:p>
-      <w:pPr>
-        <w:ind w:left="540"/>
-        <w:shd w:val="clear" w:color="auto" w:fill="F5F5F5"/>
-      </w:pPr>
       <w:r>
-        <w:rPr>
-          <w:rFonts w:ascii="Courier New" w:hAnsi="Courier New"/>
-          <w:sz w:val="20"/>
-        </w:rPr>
         <w:t>D. 55</w:t>
       </w:r>
     </w:p>
@@ -1735,207 +1324,59 @@
       <w:r>
         <w:rPr>
           <w:b/>
-          <w:color w:val="00328C"/>
-          <w:sz w:val="24"/>
         </w:rPr>
-        <w:t xml:space="preserve">  F.  VÍ DỤ KẾT HỢP NHIỀU TÍNH NĂNG  </w:t>
+        <w:t xml:space="preserve">  Kết hợp Toán + Code + Nhiều đáp án  </w:t>
       </w:r>
     </w:p>
     <w:p/>
     <w:p>
-      <w:pPr>
-        <w:ind w:left="540"/>
-        <w:shd w:val="clear" w:color="auto" w:fill="F5F5F5"/>
-      </w:pPr>
       <w:r>
-        <w:rPr>
-          <w:rFonts w:ascii="Courier New" w:hAnsi="Courier New"/>
-          <w:sz w:val="20"/>
-        </w:rPr>
-        <w:t>Câu 10. [MULTI] Cho \(f(x) = x^2\). Xét đoạn code Python tính f(3):</w:t>
+        <w:t>Câu 11. [MULTI] Cho \(f(x) = x^2\). Xét đoạn code Python tính f(3):</w:t>
       </w:r>
     </w:p>
     <w:p>
-      <w:pPr>
-        <w:ind w:left="540"/>
-        <w:shd w:val="clear" w:color="auto" w:fill="F5F5F5"/>
-      </w:pPr>
       <w:r>
-        <w:rPr>
-          <w:rFonts w:ascii="Courier New" w:hAnsi="Courier New"/>
-          <w:sz w:val="20"/>
-        </w:rPr>
         <w:t>[CODE]</w:t>
       </w:r>
     </w:p>
     <w:p>
-      <w:pPr>
-        <w:ind w:left="540"/>
-        <w:shd w:val="clear" w:color="auto" w:fill="F5F5F5"/>
-      </w:pPr>
       <w:r>
-        <w:rPr>
-          <w:rFonts w:ascii="Courier New" w:hAnsi="Courier New"/>
-          <w:sz w:val="20"/>
-        </w:rPr>
         <w:t>def f(x):</w:t>
       </w:r>
     </w:p>
     <w:p>
-      <w:pPr>
-        <w:ind w:left="540"/>
-        <w:shd w:val="clear" w:color="auto" w:fill="F5F5F5"/>
-      </w:pPr>
       <w:r>
-        <w:rPr>
-          <w:rFonts w:ascii="Courier New" w:hAnsi="Courier New"/>
-          <w:sz w:val="20"/>
-        </w:rPr>
         <w:t xml:space="preserve">    return x ** 2</w:t>
       </w:r>
     </w:p>
     <w:p>
-      <w:pPr>
-        <w:ind w:left="540"/>
-        <w:shd w:val="clear" w:color="auto" w:fill="F5F5F5"/>
-      </w:pPr>
       <w:r>
-        <w:rPr>
-          <w:rFonts w:ascii="Courier New" w:hAnsi="Courier New"/>
-          <w:sz w:val="20"/>
-        </w:rPr>
         <w:t>print(f(3))</w:t>
       </w:r>
     </w:p>
     <w:p>
-      <w:pPr>
-        <w:ind w:left="540"/>
-        <w:shd w:val="clear" w:color="auto" w:fill="F5F5F5"/>
-      </w:pPr>
       <w:r>
-        <w:rPr>
-          <w:rFonts w:ascii="Courier New" w:hAnsi="Courier New"/>
-          <w:sz w:val="20"/>
-        </w:rPr>
         <w:t>[/CODE]</w:t>
       </w:r>
     </w:p>
     <w:p>
-      <w:pPr>
-        <w:ind w:left="540"/>
-        <w:shd w:val="clear" w:color="auto" w:fill="F5F5F5"/>
-      </w:pPr>
       <w:r>
-        <w:rPr>
-          <w:rFonts w:ascii="Courier New" w:hAnsi="Courier New"/>
-          <w:sz w:val="20"/>
-        </w:rPr>
         <w:t>A. Kết quả in ra là 9 *</w:t>
       </w:r>
     </w:p>
     <w:p>
-      <w:pPr>
-        <w:ind w:left="540"/>
-        <w:shd w:val="clear" w:color="auto" w:fill="F5F5F5"/>
-      </w:pPr>
       <w:r>
-        <w:rPr>
-          <w:rFonts w:ascii="Courier New" w:hAnsi="Courier New"/>
-          <w:sz w:val="20"/>
-        </w:rPr>
         <w:t>B. Hàm f tính bình phương của x *</w:t>
       </w:r>
     </w:p>
     <w:p>
-      <w:pPr>
-        <w:ind w:left="540"/>
-        <w:shd w:val="clear" w:color="auto" w:fill="F5F5F5"/>
-      </w:pPr>
       <w:r>
-        <w:rPr>
-          <w:rFonts w:ascii="Courier New" w:hAnsi="Courier New"/>
-          <w:sz w:val="20"/>
-        </w:rPr>
         <w:t>C. Kết quả in ra là 6</w:t>
       </w:r>
     </w:p>
     <w:p>
-      <w:pPr>
-        <w:ind w:left="540"/>
-        <w:shd w:val="clear" w:color="auto" w:fill="F5F5F5"/>
-      </w:pPr>
       <w:r>
-        <w:rPr>
-          <w:rFonts w:ascii="Courier New" w:hAnsi="Courier New"/>
-          <w:sz w:val="20"/>
-        </w:rPr>
         <w:t>D. x ** 2 tương đương \(x^2\) trong toán học *</w:t>
-      </w:r>
-    </w:p>
-    <w:p/>
-    <w:p>
-      <w:pPr>
-        <w:ind w:left="540"/>
-        <w:shd w:val="clear" w:color="auto" w:fill="F5F5F5"/>
-      </w:pPr>
-      <w:r>
-        <w:rPr>
-          <w:rFonts w:ascii="Courier New" w:hAnsi="Courier New"/>
-          <w:sz w:val="20"/>
-        </w:rPr>
-        <w:t>Câu 11. [DUNG/SAI] Cho \(f(x) = x^2 - 4\), xác định đúng/sai:</w:t>
-      </w:r>
-    </w:p>
-    <w:p>
-      <w:pPr>
-        <w:ind w:left="540"/>
-        <w:shd w:val="clear" w:color="auto" w:fill="F5F5F5"/>
-      </w:pPr>
-      <w:r>
-        <w:rPr>
-          <w:rFonts w:ascii="Courier New" w:hAnsi="Courier New"/>
-          <w:sz w:val="20"/>
-        </w:rPr>
-        <w:t>A. \(f(0) = -4\) (đúng)</w:t>
-      </w:r>
-    </w:p>
-    <w:p>
-      <w:pPr>
-        <w:ind w:left="540"/>
-        <w:shd w:val="clear" w:color="auto" w:fill="F5F5F5"/>
-      </w:pPr>
-      <w:r>
-        <w:rPr>
-          <w:rFonts w:ascii="Courier New" w:hAnsi="Courier New"/>
-          <w:sz w:val="20"/>
-        </w:rPr>
-        <w:t>B. \(f(2) = 0\) (đúng)</w:t>
-      </w:r>
-    </w:p>
-    <w:p>
-      <w:pPr>
-        <w:ind w:left="540"/>
-        <w:shd w:val="clear" w:color="auto" w:fill="F5F5F5"/>
-      </w:pPr>
-      <w:r>
-        <w:rPr>
-          <w:rFonts w:ascii="Courier New" w:hAnsi="Courier New"/>
-          <w:sz w:val="20"/>
-        </w:rPr>
-        <w:t>C. \(f(-2) = 4\) (sai)</w:t>
-      </w:r>
-    </w:p>
-    <w:p>
-      <w:pPr>
-        <w:ind w:left="540"/>
-        <w:shd w:val="clear" w:color="auto" w:fill="F5F5F5"/>
-      </w:pPr>
-      <w:r>
-        <w:rPr>
-          <w:rFonts w:ascii="Courier New" w:hAnsi="Courier New"/>
-          <w:sz w:val="20"/>
-        </w:rPr>
-        <w:t>D. Hàm số đạt cực tiểu tại \(x = 0\) (đúng)</w:t>
       </w:r>
     </w:p>
     <w:p/>

</xml_diff>

<commit_message>
fix: đổi tiêu đề phần từ "A." sang "【A】" để parser không nhầm là đáp án
Co-Authored-By: Claude <noreply@anthropic.com>
</commit_message>
<xml_diff>
--- a/data/mau-cau-hoi.docx
+++ b/data/mau-cau-hoi.docx
@@ -39,7 +39,7 @@
           <w:color w:val="00328C"/>
           <w:sz w:val="24"/>
         </w:rPr>
-        <w:t xml:space="preserve">  A.  CẤU TRÚC TỔNG QUÁT MỖI CÂU HỎI  </w:t>
+        <w:t xml:space="preserve">  【A】  CẤU TRÚC TỔNG QUÁT MỖI CÂU HỎI  </w:t>
       </w:r>
     </w:p>
     <w:p/>
@@ -167,7 +167,7 @@
           <w:color w:val="00328C"/>
           <w:sz w:val="24"/>
         </w:rPr>
-        <w:t xml:space="preserve">  B.  LƯU Ý QUAN TRỌNG  </w:t>
+        <w:t xml:space="preserve">  【B】  LƯU Ý QUAN TRỌNG  </w:t>
       </w:r>
     </w:p>
     <w:p/>
@@ -234,7 +234,7 @@
           <w:color w:val="00328C"/>
           <w:sz w:val="24"/>
         </w:rPr>
-        <w:t xml:space="preserve">  C.  CÁC LOẠI CÂU HỎI  </w:t>
+        <w:t xml:space="preserve">  【C】  CÁC LOẠI CÂU HỎI  </w:t>
       </w:r>
     </w:p>
     <w:p/>
@@ -434,7 +434,7 @@
           <w:color w:val="00328C"/>
           <w:sz w:val="24"/>
         </w:rPr>
-        <w:t xml:space="preserve">  D.  CÔNG THỨC TOÁN  (LATEX / KATEX)  </w:t>
+        <w:t xml:space="preserve">  【D】  CÔNG THỨC TOÁN  (LATEX / KATEX)  </w:t>
       </w:r>
     </w:p>
     <w:p/>
@@ -849,7 +849,7 @@
           <w:color w:val="00328C"/>
           <w:sz w:val="24"/>
         </w:rPr>
-        <w:t xml:space="preserve">  E.  HIỂN THỊ CODE  [CODE] / [/CODE]  </w:t>
+        <w:t xml:space="preserve">  【E】  HIỂN THỊ CODE  [CODE] / [/CODE]  </w:t>
       </w:r>
     </w:p>
     <w:p/>

</xml_diff>

<commit_message>
fix: thêm mũi tên -> vào đầu dòng ví dụ prefix để parser không nhầm
Co-Authored-By: Claude <noreply@anthropic.com>
</commit_message>
<xml_diff>
--- a/data/mau-cau-hoi.docx
+++ b/data/mau-cau-hoi.docx
@@ -111,7 +111,7 @@
           <w:rFonts w:ascii="Courier New" w:hAnsi="Courier New"/>
           <w:sz w:val="20"/>
         </w:rPr>
-        <w:t>Câu 1.   Câu 1:   1.   1:       (có hoặc không có chữ "Câu")</w:t>
+        <w:t>→  Câu 1.   /   Câu 1:   /   1.   /   1:       (có hoặc không có chữ "Câu")</w:t>
       </w:r>
     </w:p>
     <w:p/>
@@ -137,7 +137,7 @@
           <w:rFonts w:ascii="Courier New" w:hAnsi="Courier New"/>
           <w:sz w:val="20"/>
         </w:rPr>
-        <w:t>X.   hoặc   X)      (X là chữ cái bất kỳ: A B C D E ...)</w:t>
+        <w:t>→  X.   hoặc   X)      (X là chữ cái bất kỳ: A B C D E ...)</w:t>
       </w:r>
     </w:p>
     <w:p/>

</xml_diff>